<commit_message>
Match capstone report to practicum style
</commit_message>
<xml_diff>
--- a/academic/capstone/QR Secures Capstone Defense Report.docx
+++ b/academic/capstone/QR Secures Capstone Defense Report.docx
@@ -6,12 +6,50 @@
       <w:pPr>
         <w:jc w:val="center"/>
       </w:pPr>
+      <w:r/>
+    </w:p>
+    <w:p>
+      <w:pPr>
+        <w:jc w:val="center"/>
+      </w:pPr>
+      <w:r/>
+    </w:p>
+    <w:p>
+      <w:pPr>
+        <w:spacing w:after="200"/>
+        <w:jc w:val="center"/>
+      </w:pPr>
+      <w:r>
+        <w:rPr>
+          <w:rFonts w:ascii="Times New Roman" w:hAnsi="Times New Roman"/>
+          <w:b/>
+          <w:sz w:val="28"/>
+        </w:rPr>
+        <w:t>QR Secures Security Analysis for QR Codes and Web Addresses</w:t>
+      </w:r>
+    </w:p>
+    <w:p>
+      <w:pPr>
+        <w:jc w:val="center"/>
+      </w:pPr>
+      <w:r/>
+    </w:p>
+    <w:p>
+      <w:pPr>
+        <w:jc w:val="center"/>
+      </w:pPr>
       <w:r>
         <w:rPr>
           <w:b/>
         </w:rPr>
-        <w:t>College of Computing and Information Technology</w:t>
+        <w:t>Capstone</w:t>
       </w:r>
+    </w:p>
+    <w:p>
+      <w:pPr>
+        <w:jc w:val="center"/>
+      </w:pPr>
+      <w:r/>
     </w:p>
     <w:p>
       <w:pPr>
@@ -21,7 +59,7 @@
         <w:rPr>
           <w:b/>
         </w:rPr>
-        <w:t>Capstone Project Defense Report</w:t>
+        <w:t>WINTER 2026</w:t>
       </w:r>
     </w:p>
     <w:p>
@@ -29,15 +67,6 @@
         <w:jc w:val="center"/>
       </w:pPr>
       <w:r/>
-    </w:p>
-    <w:p>
-      <w:pPr>
-        <w:pStyle w:val="Title"/>
-        <w:jc w:val="center"/>
-      </w:pPr>
-      <w:r>
-        <w:t>QR Secures Security Analysis for QR Codes and Web Addresses</w:t>
-      </w:r>
     </w:p>
     <w:p>
       <w:pPr>
@@ -47,395 +76,90 @@
         <w:rPr>
           <w:b/>
         </w:rPr>
-        <w:t>Capstone Project</w:t>
+        <w:t>Supervisor: Dr. ADNAN</w:t>
       </w:r>
     </w:p>
     <w:p>
       <w:pPr>
         <w:jc w:val="center"/>
       </w:pPr>
+      <w:r/>
+    </w:p>
+    <w:p>
+      <w:pPr>
+        <w:jc w:val="center"/>
+      </w:pPr>
       <w:r>
-        <w:t>Winter 2026</w:t>
+        <w:rPr>
+          <w:b/>
+        </w:rPr>
+        <w:t>Team Members</w:t>
       </w:r>
     </w:p>
     <w:p>
       <w:pPr>
         <w:jc w:val="center"/>
       </w:pPr>
+      <w:r>
+        <w:t>Manea Al Shabrain (Leader)</w:t>
+        <w:br/>
+        <w:t>Sulaiman Abdo</w:t>
+        <w:br/>
+        <w:t>Saeed Alsawaf</w:t>
+        <w:br/>
+        <w:t>Mohammad Albustami</w:t>
+        <w:br/>
+        <w:t>Salah Alharbi</w:t>
+      </w:r>
+    </w:p>
+    <w:p>
+      <w:pPr>
+        <w:jc w:val="center"/>
+      </w:pPr>
       <w:r/>
     </w:p>
-    <w:tbl>
-      <w:tblPr>
-        <w:tblStyle w:val="TableGrid"/>
-        <w:tblW w:type="auto" w:w="0"/>
+    <w:p>
+      <w:pPr>
         <w:jc w:val="center"/>
-        <w:tblLayout w:type="fixed"/>
-        <w:tblLook w:firstColumn="1" w:firstRow="1" w:lastColumn="0" w:lastRow="0" w:noHBand="0" w:noVBand="1" w:val="04A0"/>
-      </w:tblPr>
-      <w:tblGrid>
-        <w:gridCol w:w="4896"/>
-        <w:gridCol w:w="4896"/>
-      </w:tblGrid>
-      <w:tr>
-        <w:trPr>
-          <w:tblHeader w:val="true"/>
-          <w:cantSplit/>
-        </w:trPr>
-        <w:tc>
-          <w:tcPr>
-            <w:tcW w:type="dxa" w:w="2880"/>
-            <w:shd w:fill="1F4E78"/>
-            <w:vAlign w:val="center"/>
-            <w:tcMar>
-              <w:top w:w="90" w:type="dxa"/>
-              <w:start w:w="100" w:type="dxa"/>
-              <w:bottom w:w="90" w:type="dxa"/>
-              <w:end w:w="100" w:type="dxa"/>
-            </w:tcMar>
-          </w:tcPr>
-          <w:p>
-            <w:pPr>
-              <w:jc w:val="center"/>
-            </w:pPr>
-            <w:r>
-              <w:rPr>
-                <w:rFonts w:ascii="Times New Roman" w:hAnsi="Times New Roman"/>
-                <w:b/>
-                <w:color w:val="FFFFFF"/>
-                <w:sz w:val="20"/>
-              </w:rPr>
-              <w:t>Project information</w:t>
-            </w:r>
-          </w:p>
-        </w:tc>
-        <w:tc>
-          <w:tcPr>
-            <w:tcW w:type="dxa" w:w="6624"/>
-            <w:shd w:fill="1F4E78"/>
-            <w:vAlign w:val="center"/>
-            <w:tcMar>
-              <w:top w:w="90" w:type="dxa"/>
-              <w:start w:w="100" w:type="dxa"/>
-              <w:bottom w:w="90" w:type="dxa"/>
-              <w:end w:w="100" w:type="dxa"/>
-            </w:tcMar>
-          </w:tcPr>
-          <w:p>
-            <w:pPr>
-              <w:jc w:val="center"/>
-            </w:pPr>
-            <w:r>
-              <w:rPr>
-                <w:rFonts w:ascii="Times New Roman" w:hAnsi="Times New Roman"/>
-                <w:b/>
-                <w:color w:val="FFFFFF"/>
-                <w:sz w:val="20"/>
-              </w:rPr>
-              <w:t>Details</w:t>
-            </w:r>
-          </w:p>
-        </w:tc>
-      </w:tr>
-      <w:tr>
-        <w:trPr>
-          <w:cantSplit/>
-        </w:trPr>
-        <w:tc>
-          <w:tcPr>
-            <w:tcW w:type="dxa" w:w="2880"/>
-            <w:vAlign w:val="center"/>
-            <w:tcMar>
-              <w:top w:w="90" w:type="dxa"/>
-              <w:start w:w="100" w:type="dxa"/>
-              <w:bottom w:w="90" w:type="dxa"/>
-              <w:end w:w="100" w:type="dxa"/>
-            </w:tcMar>
-          </w:tcPr>
-          <w:p>
-            <w:pPr>
-              <w:jc w:val="left"/>
-            </w:pPr>
-            <w:r>
-              <w:rPr>
-                <w:rFonts w:ascii="Times New Roman" w:hAnsi="Times New Roman"/>
-                <w:color w:val="000000"/>
-                <w:sz w:val="20"/>
-              </w:rPr>
-              <w:t>Program</w:t>
-            </w:r>
-          </w:p>
-        </w:tc>
-        <w:tc>
-          <w:tcPr>
-            <w:tcW w:type="dxa" w:w="6624"/>
-            <w:vAlign w:val="center"/>
-            <w:tcMar>
-              <w:top w:w="90" w:type="dxa"/>
-              <w:start w:w="100" w:type="dxa"/>
-              <w:bottom w:w="90" w:type="dxa"/>
-              <w:end w:w="100" w:type="dxa"/>
-            </w:tcMar>
-          </w:tcPr>
-          <w:p>
-            <w:pPr>
-              <w:jc w:val="left"/>
-            </w:pPr>
-            <w:r>
-              <w:rPr>
-                <w:rFonts w:ascii="Times New Roman" w:hAnsi="Times New Roman"/>
-                <w:color w:val="000000"/>
-                <w:sz w:val="20"/>
-              </w:rPr>
-              <w:t>B.Sc. Cyber Security and Data</w:t>
-            </w:r>
-          </w:p>
-        </w:tc>
-      </w:tr>
-      <w:tr>
-        <w:trPr>
-          <w:cantSplit/>
-        </w:trPr>
-        <w:tc>
-          <w:tcPr>
-            <w:tcW w:type="dxa" w:w="2880"/>
-            <w:vAlign w:val="center"/>
-            <w:tcMar>
-              <w:top w:w="90" w:type="dxa"/>
-              <w:start w:w="100" w:type="dxa"/>
-              <w:bottom w:w="90" w:type="dxa"/>
-              <w:end w:w="100" w:type="dxa"/>
-            </w:tcMar>
-            <w:shd w:fill="EAF2F8"/>
-          </w:tcPr>
-          <w:p>
-            <w:pPr>
-              <w:jc w:val="left"/>
-            </w:pPr>
-            <w:r>
-              <w:rPr>
-                <w:rFonts w:ascii="Times New Roman" w:hAnsi="Times New Roman"/>
-                <w:color w:val="000000"/>
-                <w:sz w:val="20"/>
-              </w:rPr>
-              <w:t>Supervisor</w:t>
-            </w:r>
-          </w:p>
-        </w:tc>
-        <w:tc>
-          <w:tcPr>
-            <w:tcW w:type="dxa" w:w="6624"/>
-            <w:vAlign w:val="center"/>
-            <w:tcMar>
-              <w:top w:w="90" w:type="dxa"/>
-              <w:start w:w="100" w:type="dxa"/>
-              <w:bottom w:w="90" w:type="dxa"/>
-              <w:end w:w="100" w:type="dxa"/>
-            </w:tcMar>
-            <w:shd w:fill="EAF2F8"/>
-          </w:tcPr>
-          <w:p>
-            <w:pPr>
-              <w:jc w:val="left"/>
-            </w:pPr>
-            <w:r>
-              <w:rPr>
-                <w:rFonts w:ascii="Times New Roman" w:hAnsi="Times New Roman"/>
-                <w:color w:val="000000"/>
-                <w:sz w:val="20"/>
-              </w:rPr>
-              <w:t>Dr. Adnan</w:t>
-            </w:r>
-          </w:p>
-        </w:tc>
-      </w:tr>
-      <w:tr>
-        <w:trPr>
-          <w:cantSplit/>
-        </w:trPr>
-        <w:tc>
-          <w:tcPr>
-            <w:tcW w:type="dxa" w:w="2880"/>
-            <w:vAlign w:val="center"/>
-            <w:tcMar>
-              <w:top w:w="90" w:type="dxa"/>
-              <w:start w:w="100" w:type="dxa"/>
-              <w:bottom w:w="90" w:type="dxa"/>
-              <w:end w:w="100" w:type="dxa"/>
-            </w:tcMar>
-          </w:tcPr>
-          <w:p>
-            <w:pPr>
-              <w:jc w:val="left"/>
-            </w:pPr>
-            <w:r>
-              <w:rPr>
-                <w:rFonts w:ascii="Times New Roman" w:hAnsi="Times New Roman"/>
-                <w:color w:val="000000"/>
-                <w:sz w:val="20"/>
-              </w:rPr>
-              <w:t>Project leader</w:t>
-            </w:r>
-          </w:p>
-        </w:tc>
-        <w:tc>
-          <w:tcPr>
-            <w:tcW w:type="dxa" w:w="6624"/>
-            <w:vAlign w:val="center"/>
-            <w:tcMar>
-              <w:top w:w="90" w:type="dxa"/>
-              <w:start w:w="100" w:type="dxa"/>
-              <w:bottom w:w="90" w:type="dxa"/>
-              <w:end w:w="100" w:type="dxa"/>
-            </w:tcMar>
-          </w:tcPr>
-          <w:p>
-            <w:pPr>
-              <w:jc w:val="left"/>
-            </w:pPr>
-            <w:r>
-              <w:rPr>
-                <w:rFonts w:ascii="Times New Roman" w:hAnsi="Times New Roman"/>
-                <w:color w:val="000000"/>
-                <w:sz w:val="20"/>
-              </w:rPr>
-              <w:t>Manea Al Shabrain</w:t>
-            </w:r>
-          </w:p>
-        </w:tc>
-      </w:tr>
-      <w:tr>
-        <w:trPr>
-          <w:cantSplit/>
-        </w:trPr>
-        <w:tc>
-          <w:tcPr>
-            <w:tcW w:type="dxa" w:w="2880"/>
-            <w:vAlign w:val="center"/>
-            <w:tcMar>
-              <w:top w:w="90" w:type="dxa"/>
-              <w:start w:w="100" w:type="dxa"/>
-              <w:bottom w:w="90" w:type="dxa"/>
-              <w:end w:w="100" w:type="dxa"/>
-            </w:tcMar>
-            <w:shd w:fill="EAF2F8"/>
-          </w:tcPr>
-          <w:p>
-            <w:pPr>
-              <w:jc w:val="left"/>
-            </w:pPr>
-            <w:r>
-              <w:rPr>
-                <w:rFonts w:ascii="Times New Roman" w:hAnsi="Times New Roman"/>
-                <w:color w:val="000000"/>
-                <w:sz w:val="20"/>
-              </w:rPr>
-              <w:t>Team members</w:t>
-            </w:r>
-          </w:p>
-        </w:tc>
-        <w:tc>
-          <w:tcPr>
-            <w:tcW w:type="dxa" w:w="6624"/>
-            <w:vAlign w:val="center"/>
-            <w:tcMar>
-              <w:top w:w="90" w:type="dxa"/>
-              <w:start w:w="100" w:type="dxa"/>
-              <w:bottom w:w="90" w:type="dxa"/>
-              <w:end w:w="100" w:type="dxa"/>
-            </w:tcMar>
-            <w:shd w:fill="EAF2F8"/>
-          </w:tcPr>
-          <w:p>
-            <w:pPr>
-              <w:jc w:val="left"/>
-            </w:pPr>
-            <w:r>
-              <w:rPr>
-                <w:rFonts w:ascii="Times New Roman" w:hAnsi="Times New Roman"/>
-                <w:color w:val="000000"/>
-                <w:sz w:val="20"/>
-              </w:rPr>
-              <w:t>Sulaiman Abdo</w:t>
-              <w:br/>
-              <w:t>Saeed Alsawaf</w:t>
-              <w:br/>
-              <w:t>Mohammad Albustami</w:t>
-              <w:br/>
-              <w:t>Salah Alharbi</w:t>
-            </w:r>
-          </w:p>
-        </w:tc>
-      </w:tr>
-      <w:tr>
-        <w:trPr>
-          <w:cantSplit/>
-        </w:trPr>
-        <w:tc>
-          <w:tcPr>
-            <w:tcW w:type="dxa" w:w="2880"/>
-            <w:vAlign w:val="center"/>
-            <w:tcMar>
-              <w:top w:w="90" w:type="dxa"/>
-              <w:start w:w="100" w:type="dxa"/>
-              <w:bottom w:w="90" w:type="dxa"/>
-              <w:end w:w="100" w:type="dxa"/>
-            </w:tcMar>
-          </w:tcPr>
-          <w:p>
-            <w:pPr>
-              <w:jc w:val="left"/>
-            </w:pPr>
-            <w:r>
-              <w:rPr>
-                <w:rFonts w:ascii="Times New Roman" w:hAnsi="Times New Roman"/>
-                <w:color w:val="000000"/>
-                <w:sz w:val="20"/>
-              </w:rPr>
-              <w:t>Application</w:t>
-            </w:r>
-          </w:p>
-        </w:tc>
-        <w:tc>
-          <w:tcPr>
-            <w:tcW w:type="dxa" w:w="6624"/>
-            <w:vAlign w:val="center"/>
-            <w:tcMar>
-              <w:top w:w="90" w:type="dxa"/>
-              <w:start w:w="100" w:type="dxa"/>
-              <w:bottom w:w="90" w:type="dxa"/>
-              <w:end w:w="100" w:type="dxa"/>
-            </w:tcMar>
-          </w:tcPr>
-          <w:p>
-            <w:pPr>
-              <w:jc w:val="left"/>
-            </w:pPr>
-            <w:r>
-              <w:rPr>
-                <w:rFonts w:ascii="Times New Roman" w:hAnsi="Times New Roman"/>
-                <w:color w:val="000000"/>
-                <w:sz w:val="20"/>
-              </w:rPr>
-              <w:t>https://qrsecures.base44.app</w:t>
-            </w:r>
-          </w:p>
-        </w:tc>
-      </w:tr>
-    </w:tbl>
-    <w:p>
-      <w:pPr>
-        <w:spacing w:after="40"/>
-      </w:pPr>
+      </w:pPr>
+      <w:r>
+        <w:rPr>
+          <w:b/>
+        </w:rPr>
+        <w:t>Application</w:t>
+      </w:r>
     </w:p>
     <w:p>
       <w:pPr>
         <w:jc w:val="center"/>
       </w:pPr>
       <w:r>
+        <w:t>https://qrsecures.base44.app</w:t>
+      </w:r>
+    </w:p>
+    <w:p>
+      <w:pPr>
+        <w:jc w:val="center"/>
+      </w:pPr>
+      <w:r/>
+    </w:p>
+    <w:p>
+      <w:pPr>
+        <w:jc w:val="center"/>
+      </w:pPr>
+      <w:r>
         <w:rPr>
-          <w:i/>
+          <w:b/>
         </w:rPr>
-        <w:t>This public academic copy omits student identification numbers and private account information.</w:t>
+        <w:t>Date</w:t>
+      </w:r>
+    </w:p>
+    <w:p>
+      <w:pPr>
+        <w:jc w:val="center"/>
+      </w:pPr>
+      <w:r>
+        <w:t>13/Sep/2026</w:t>
       </w:r>
     </w:p>
     <w:p>
@@ -874,9 +598,9 @@
         <w:tblLook w:firstColumn="1" w:firstRow="1" w:lastColumn="0" w:lastRow="0" w:noHBand="0" w:noVBand="1" w:val="04A0"/>
       </w:tblPr>
       <w:tblGrid>
-        <w:gridCol w:w="3264"/>
-        <w:gridCol w:w="3264"/>
-        <w:gridCol w:w="3264"/>
+        <w:gridCol w:w="2722"/>
+        <w:gridCol w:w="2722"/>
+        <w:gridCol w:w="2722"/>
       </w:tblGrid>
       <w:tr>
         <w:trPr>
@@ -885,8 +609,7 @@
         </w:trPr>
         <w:tc>
           <w:tcPr>
-            <w:tcW w:type="dxa" w:w="2160"/>
-            <w:shd w:fill="1F4E78"/>
+            <w:tcW w:type="dxa" w:w="1801"/>
             <w:vAlign w:val="center"/>
             <w:tcMar>
               <w:top w:w="90" w:type="dxa"/>
@@ -903,7 +626,7 @@
               <w:rPr>
                 <w:rFonts w:ascii="Times New Roman" w:hAnsi="Times New Roman"/>
                 <w:b/>
-                <w:color w:val="FFFFFF"/>
+                <w:color w:val="000000"/>
                 <w:sz w:val="20"/>
               </w:rPr>
               <w:t>User group</w:t>
@@ -912,8 +635,7 @@
         </w:tc>
         <w:tc>
           <w:tcPr>
-            <w:tcW w:type="dxa" w:w="3168"/>
-            <w:shd w:fill="1F4E78"/>
+            <w:tcW w:type="dxa" w:w="2642"/>
             <w:vAlign w:val="center"/>
             <w:tcMar>
               <w:top w:w="90" w:type="dxa"/>
@@ -930,7 +652,7 @@
               <w:rPr>
                 <w:rFonts w:ascii="Times New Roman" w:hAnsi="Times New Roman"/>
                 <w:b/>
-                <w:color w:val="FFFFFF"/>
+                <w:color w:val="000000"/>
                 <w:sz w:val="20"/>
               </w:rPr>
               <w:t>Main need</w:t>
@@ -939,8 +661,7 @@
         </w:tc>
         <w:tc>
           <w:tcPr>
-            <w:tcW w:type="dxa" w:w="4464"/>
-            <w:shd w:fill="1F4E78"/>
+            <w:tcW w:type="dxa" w:w="3722"/>
             <w:vAlign w:val="center"/>
             <w:tcMar>
               <w:top w:w="90" w:type="dxa"/>
@@ -957,7 +678,7 @@
               <w:rPr>
                 <w:rFonts w:ascii="Times New Roman" w:hAnsi="Times New Roman"/>
                 <w:b/>
-                <w:color w:val="FFFFFF"/>
+                <w:color w:val="000000"/>
                 <w:sz w:val="20"/>
               </w:rPr>
               <w:t>Application support</w:t>
@@ -971,7 +692,7 @@
         </w:trPr>
         <w:tc>
           <w:tcPr>
-            <w:tcW w:type="dxa" w:w="2160"/>
+            <w:tcW w:type="dxa" w:w="1801"/>
             <w:vAlign w:val="center"/>
             <w:tcMar>
               <w:top w:w="90" w:type="dxa"/>
@@ -996,7 +717,7 @@
         </w:tc>
         <w:tc>
           <w:tcPr>
-            <w:tcW w:type="dxa" w:w="3168"/>
+            <w:tcW w:type="dxa" w:w="2642"/>
             <w:vAlign w:val="center"/>
             <w:tcMar>
               <w:top w:w="90" w:type="dxa"/>
@@ -1021,7 +742,7 @@
         </w:tc>
         <w:tc>
           <w:tcPr>
-            <w:tcW w:type="dxa" w:w="4464"/>
+            <w:tcW w:type="dxa" w:w="3722"/>
             <w:vAlign w:val="center"/>
             <w:tcMar>
               <w:top w:w="90" w:type="dxa"/>
@@ -1051,7 +772,7 @@
         </w:trPr>
         <w:tc>
           <w:tcPr>
-            <w:tcW w:type="dxa" w:w="2160"/>
+            <w:tcW w:type="dxa" w:w="1801"/>
             <w:vAlign w:val="center"/>
             <w:tcMar>
               <w:top w:w="90" w:type="dxa"/>
@@ -1059,7 +780,6 @@
               <w:bottom w:w="90" w:type="dxa"/>
               <w:end w:w="100" w:type="dxa"/>
             </w:tcMar>
-            <w:shd w:fill="EAF2F8"/>
           </w:tcPr>
           <w:p>
             <w:pPr>
@@ -1077,7 +797,7 @@
         </w:tc>
         <w:tc>
           <w:tcPr>
-            <w:tcW w:type="dxa" w:w="3168"/>
+            <w:tcW w:type="dxa" w:w="2642"/>
             <w:vAlign w:val="center"/>
             <w:tcMar>
               <w:top w:w="90" w:type="dxa"/>
@@ -1085,7 +805,6 @@
               <w:bottom w:w="90" w:type="dxa"/>
               <w:end w:w="100" w:type="dxa"/>
             </w:tcMar>
-            <w:shd w:fill="EAF2F8"/>
           </w:tcPr>
           <w:p>
             <w:pPr>
@@ -1103,7 +822,7 @@
         </w:tc>
         <w:tc>
           <w:tcPr>
-            <w:tcW w:type="dxa" w:w="4464"/>
+            <w:tcW w:type="dxa" w:w="3722"/>
             <w:vAlign w:val="center"/>
             <w:tcMar>
               <w:top w:w="90" w:type="dxa"/>
@@ -1111,7 +830,6 @@
               <w:bottom w:w="90" w:type="dxa"/>
               <w:end w:w="100" w:type="dxa"/>
             </w:tcMar>
-            <w:shd w:fill="EAF2F8"/>
           </w:tcPr>
           <w:p>
             <w:pPr>
@@ -1134,7 +852,7 @@
         </w:trPr>
         <w:tc>
           <w:tcPr>
-            <w:tcW w:type="dxa" w:w="2160"/>
+            <w:tcW w:type="dxa" w:w="1801"/>
             <w:vAlign w:val="center"/>
             <w:tcMar>
               <w:top w:w="90" w:type="dxa"/>
@@ -1159,7 +877,7 @@
         </w:tc>
         <w:tc>
           <w:tcPr>
-            <w:tcW w:type="dxa" w:w="3168"/>
+            <w:tcW w:type="dxa" w:w="2642"/>
             <w:vAlign w:val="center"/>
             <w:tcMar>
               <w:top w:w="90" w:type="dxa"/>
@@ -1184,7 +902,7 @@
         </w:tc>
         <w:tc>
           <w:tcPr>
-            <w:tcW w:type="dxa" w:w="4464"/>
+            <w:tcW w:type="dxa" w:w="3722"/>
             <w:vAlign w:val="center"/>
             <w:tcMar>
               <w:top w:w="90" w:type="dxa"/>
@@ -1364,8 +1082,8 @@
         <w:tblLook w:firstColumn="1" w:firstRow="1" w:lastColumn="0" w:lastRow="0" w:noHBand="0" w:noVBand="1" w:val="04A0"/>
       </w:tblPr>
       <w:tblGrid>
-        <w:gridCol w:w="4896"/>
-        <w:gridCol w:w="4896"/>
+        <w:gridCol w:w="4082"/>
+        <w:gridCol w:w="4082"/>
       </w:tblGrid>
       <w:tr>
         <w:trPr>
@@ -1374,8 +1092,7 @@
         </w:trPr>
         <w:tc>
           <w:tcPr>
-            <w:tcW w:type="dxa" w:w="1944"/>
-            <w:shd w:fill="1F4E78"/>
+            <w:tcW w:type="dxa" w:w="1621"/>
             <w:vAlign w:val="center"/>
             <w:tcMar>
               <w:top w:w="90" w:type="dxa"/>
@@ -1392,7 +1109,7 @@
               <w:rPr>
                 <w:rFonts w:ascii="Times New Roman" w:hAnsi="Times New Roman"/>
                 <w:b/>
-                <w:color w:val="FFFFFF"/>
+                <w:color w:val="000000"/>
                 <w:sz w:val="20"/>
               </w:rPr>
               <w:t>Area</w:t>
@@ -1401,8 +1118,7 @@
         </w:tc>
         <w:tc>
           <w:tcPr>
-            <w:tcW w:type="dxa" w:w="7848"/>
-            <w:shd w:fill="1F4E78"/>
+            <w:tcW w:type="dxa" w:w="6544"/>
             <w:vAlign w:val="center"/>
             <w:tcMar>
               <w:top w:w="90" w:type="dxa"/>
@@ -1419,7 +1135,7 @@
               <w:rPr>
                 <w:rFonts w:ascii="Times New Roman" w:hAnsi="Times New Roman"/>
                 <w:b/>
-                <w:color w:val="FFFFFF"/>
+                <w:color w:val="000000"/>
                 <w:sz w:val="20"/>
               </w:rPr>
               <w:t>Requirement</w:t>
@@ -1433,7 +1149,7 @@
         </w:trPr>
         <w:tc>
           <w:tcPr>
-            <w:tcW w:type="dxa" w:w="1944"/>
+            <w:tcW w:type="dxa" w:w="1621"/>
             <w:vAlign w:val="center"/>
             <w:tcMar>
               <w:top w:w="90" w:type="dxa"/>
@@ -1458,7 +1174,7 @@
         </w:tc>
         <w:tc>
           <w:tcPr>
-            <w:tcW w:type="dxa" w:w="7848"/>
+            <w:tcW w:type="dxa" w:w="6544"/>
             <w:vAlign w:val="center"/>
             <w:tcMar>
               <w:top w:w="90" w:type="dxa"/>
@@ -1488,7 +1204,7 @@
         </w:trPr>
         <w:tc>
           <w:tcPr>
-            <w:tcW w:type="dxa" w:w="1944"/>
+            <w:tcW w:type="dxa" w:w="1621"/>
             <w:vAlign w:val="center"/>
             <w:tcMar>
               <w:top w:w="90" w:type="dxa"/>
@@ -1496,7 +1212,6 @@
               <w:bottom w:w="90" w:type="dxa"/>
               <w:end w:w="100" w:type="dxa"/>
             </w:tcMar>
-            <w:shd w:fill="EAF2F8"/>
           </w:tcPr>
           <w:p>
             <w:pPr>
@@ -1514,7 +1229,7 @@
         </w:tc>
         <w:tc>
           <w:tcPr>
-            <w:tcW w:type="dxa" w:w="7848"/>
+            <w:tcW w:type="dxa" w:w="6544"/>
             <w:vAlign w:val="center"/>
             <w:tcMar>
               <w:top w:w="90" w:type="dxa"/>
@@ -1522,7 +1237,6 @@
               <w:bottom w:w="90" w:type="dxa"/>
               <w:end w:w="100" w:type="dxa"/>
             </w:tcMar>
-            <w:shd w:fill="EAF2F8"/>
           </w:tcPr>
           <w:p>
             <w:pPr>
@@ -1545,7 +1259,7 @@
         </w:trPr>
         <w:tc>
           <w:tcPr>
-            <w:tcW w:type="dxa" w:w="1944"/>
+            <w:tcW w:type="dxa" w:w="1621"/>
             <w:vAlign w:val="center"/>
             <w:tcMar>
               <w:top w:w="90" w:type="dxa"/>
@@ -1570,7 +1284,7 @@
         </w:tc>
         <w:tc>
           <w:tcPr>
-            <w:tcW w:type="dxa" w:w="7848"/>
+            <w:tcW w:type="dxa" w:w="6544"/>
             <w:vAlign w:val="center"/>
             <w:tcMar>
               <w:top w:w="90" w:type="dxa"/>
@@ -1600,7 +1314,7 @@
         </w:trPr>
         <w:tc>
           <w:tcPr>
-            <w:tcW w:type="dxa" w:w="1944"/>
+            <w:tcW w:type="dxa" w:w="1621"/>
             <w:vAlign w:val="center"/>
             <w:tcMar>
               <w:top w:w="90" w:type="dxa"/>
@@ -1608,7 +1322,6 @@
               <w:bottom w:w="90" w:type="dxa"/>
               <w:end w:w="100" w:type="dxa"/>
             </w:tcMar>
-            <w:shd w:fill="EAF2F8"/>
           </w:tcPr>
           <w:p>
             <w:pPr>
@@ -1626,7 +1339,7 @@
         </w:tc>
         <w:tc>
           <w:tcPr>
-            <w:tcW w:type="dxa" w:w="7848"/>
+            <w:tcW w:type="dxa" w:w="6544"/>
             <w:vAlign w:val="center"/>
             <w:tcMar>
               <w:top w:w="90" w:type="dxa"/>
@@ -1634,7 +1347,6 @@
               <w:bottom w:w="90" w:type="dxa"/>
               <w:end w:w="100" w:type="dxa"/>
             </w:tcMar>
-            <w:shd w:fill="EAF2F8"/>
           </w:tcPr>
           <w:p>
             <w:pPr>
@@ -1657,7 +1369,7 @@
         </w:trPr>
         <w:tc>
           <w:tcPr>
-            <w:tcW w:type="dxa" w:w="1944"/>
+            <w:tcW w:type="dxa" w:w="1621"/>
             <w:vAlign w:val="center"/>
             <w:tcMar>
               <w:top w:w="90" w:type="dxa"/>
@@ -1682,7 +1394,7 @@
         </w:tc>
         <w:tc>
           <w:tcPr>
-            <w:tcW w:type="dxa" w:w="7848"/>
+            <w:tcW w:type="dxa" w:w="6544"/>
             <w:vAlign w:val="center"/>
             <w:tcMar>
               <w:top w:w="90" w:type="dxa"/>
@@ -1712,7 +1424,7 @@
         </w:trPr>
         <w:tc>
           <w:tcPr>
-            <w:tcW w:type="dxa" w:w="1944"/>
+            <w:tcW w:type="dxa" w:w="1621"/>
             <w:vAlign w:val="center"/>
             <w:tcMar>
               <w:top w:w="90" w:type="dxa"/>
@@ -1720,7 +1432,6 @@
               <w:bottom w:w="90" w:type="dxa"/>
               <w:end w:w="100" w:type="dxa"/>
             </w:tcMar>
-            <w:shd w:fill="EAF2F8"/>
           </w:tcPr>
           <w:p>
             <w:pPr>
@@ -1738,7 +1449,7 @@
         </w:tc>
         <w:tc>
           <w:tcPr>
-            <w:tcW w:type="dxa" w:w="7848"/>
+            <w:tcW w:type="dxa" w:w="6544"/>
             <w:vAlign w:val="center"/>
             <w:tcMar>
               <w:top w:w="90" w:type="dxa"/>
@@ -1746,7 +1457,6 @@
               <w:bottom w:w="90" w:type="dxa"/>
               <w:end w:w="100" w:type="dxa"/>
             </w:tcMar>
-            <w:shd w:fill="EAF2F8"/>
           </w:tcPr>
           <w:p>
             <w:pPr>
@@ -1769,7 +1479,7 @@
         </w:trPr>
         <w:tc>
           <w:tcPr>
-            <w:tcW w:type="dxa" w:w="1944"/>
+            <w:tcW w:type="dxa" w:w="1621"/>
             <w:vAlign w:val="center"/>
             <w:tcMar>
               <w:top w:w="90" w:type="dxa"/>
@@ -1794,7 +1504,7 @@
         </w:tc>
         <w:tc>
           <w:tcPr>
-            <w:tcW w:type="dxa" w:w="7848"/>
+            <w:tcW w:type="dxa" w:w="6544"/>
             <w:vAlign w:val="center"/>
             <w:tcMar>
               <w:top w:w="90" w:type="dxa"/>
@@ -1824,7 +1534,7 @@
         </w:trPr>
         <w:tc>
           <w:tcPr>
-            <w:tcW w:type="dxa" w:w="1944"/>
+            <w:tcW w:type="dxa" w:w="1621"/>
             <w:vAlign w:val="center"/>
             <w:tcMar>
               <w:top w:w="90" w:type="dxa"/>
@@ -1832,7 +1542,6 @@
               <w:bottom w:w="90" w:type="dxa"/>
               <w:end w:w="100" w:type="dxa"/>
             </w:tcMar>
-            <w:shd w:fill="EAF2F8"/>
           </w:tcPr>
           <w:p>
             <w:pPr>
@@ -1850,7 +1559,7 @@
         </w:tc>
         <w:tc>
           <w:tcPr>
-            <w:tcW w:type="dxa" w:w="7848"/>
+            <w:tcW w:type="dxa" w:w="6544"/>
             <w:vAlign w:val="center"/>
             <w:tcMar>
               <w:top w:w="90" w:type="dxa"/>
@@ -1858,7 +1567,6 @@
               <w:bottom w:w="90" w:type="dxa"/>
               <w:end w:w="100" w:type="dxa"/>
             </w:tcMar>
-            <w:shd w:fill="EAF2F8"/>
           </w:tcPr>
           <w:p>
             <w:pPr>
@@ -1881,7 +1589,7 @@
         </w:trPr>
         <w:tc>
           <w:tcPr>
-            <w:tcW w:type="dxa" w:w="1944"/>
+            <w:tcW w:type="dxa" w:w="1621"/>
             <w:vAlign w:val="center"/>
             <w:tcMar>
               <w:top w:w="90" w:type="dxa"/>
@@ -1906,7 +1614,7 @@
         </w:tc>
         <w:tc>
           <w:tcPr>
-            <w:tcW w:type="dxa" w:w="7848"/>
+            <w:tcW w:type="dxa" w:w="6544"/>
             <w:vAlign w:val="center"/>
             <w:tcMar>
               <w:top w:w="90" w:type="dxa"/>
@@ -1936,7 +1644,7 @@
         </w:trPr>
         <w:tc>
           <w:tcPr>
-            <w:tcW w:type="dxa" w:w="1944"/>
+            <w:tcW w:type="dxa" w:w="1621"/>
             <w:vAlign w:val="center"/>
             <w:tcMar>
               <w:top w:w="90" w:type="dxa"/>
@@ -1944,7 +1652,6 @@
               <w:bottom w:w="90" w:type="dxa"/>
               <w:end w:w="100" w:type="dxa"/>
             </w:tcMar>
-            <w:shd w:fill="EAF2F8"/>
           </w:tcPr>
           <w:p>
             <w:pPr>
@@ -1962,7 +1669,7 @@
         </w:tc>
         <w:tc>
           <w:tcPr>
-            <w:tcW w:type="dxa" w:w="7848"/>
+            <w:tcW w:type="dxa" w:w="6544"/>
             <w:vAlign w:val="center"/>
             <w:tcMar>
               <w:top w:w="90" w:type="dxa"/>
@@ -1970,7 +1677,6 @@
               <w:bottom w:w="90" w:type="dxa"/>
               <w:end w:w="100" w:type="dxa"/>
             </w:tcMar>
-            <w:shd w:fill="EAF2F8"/>
           </w:tcPr>
           <w:p>
             <w:pPr>
@@ -2010,8 +1716,8 @@
         <w:tblLook w:firstColumn="1" w:firstRow="1" w:lastColumn="0" w:lastRow="0" w:noHBand="0" w:noVBand="1" w:val="04A0"/>
       </w:tblPr>
       <w:tblGrid>
-        <w:gridCol w:w="4896"/>
-        <w:gridCol w:w="4896"/>
+        <w:gridCol w:w="4082"/>
+        <w:gridCol w:w="4082"/>
       </w:tblGrid>
       <w:tr>
         <w:trPr>
@@ -2020,8 +1726,7 @@
         </w:trPr>
         <w:tc>
           <w:tcPr>
-            <w:tcW w:type="dxa" w:w="1944"/>
-            <w:shd w:fill="1F4E78"/>
+            <w:tcW w:type="dxa" w:w="1621"/>
             <w:vAlign w:val="center"/>
             <w:tcMar>
               <w:top w:w="90" w:type="dxa"/>
@@ -2038,7 +1743,7 @@
               <w:rPr>
                 <w:rFonts w:ascii="Times New Roman" w:hAnsi="Times New Roman"/>
                 <w:b/>
-                <w:color w:val="FFFFFF"/>
+                <w:color w:val="000000"/>
                 <w:sz w:val="20"/>
               </w:rPr>
               <w:t>Quality</w:t>
@@ -2047,8 +1752,7 @@
         </w:tc>
         <w:tc>
           <w:tcPr>
-            <w:tcW w:type="dxa" w:w="7848"/>
-            <w:shd w:fill="1F4E78"/>
+            <w:tcW w:type="dxa" w:w="6544"/>
             <w:vAlign w:val="center"/>
             <w:tcMar>
               <w:top w:w="90" w:type="dxa"/>
@@ -2065,7 +1769,7 @@
               <w:rPr>
                 <w:rFonts w:ascii="Times New Roman" w:hAnsi="Times New Roman"/>
                 <w:b/>
-                <w:color w:val="FFFFFF"/>
+                <w:color w:val="000000"/>
                 <w:sz w:val="20"/>
               </w:rPr>
               <w:t>Expected behavior</w:t>
@@ -2079,7 +1783,7 @@
         </w:trPr>
         <w:tc>
           <w:tcPr>
-            <w:tcW w:type="dxa" w:w="1944"/>
+            <w:tcW w:type="dxa" w:w="1621"/>
             <w:vAlign w:val="center"/>
             <w:tcMar>
               <w:top w:w="90" w:type="dxa"/>
@@ -2104,7 +1808,7 @@
         </w:tc>
         <w:tc>
           <w:tcPr>
-            <w:tcW w:type="dxa" w:w="7848"/>
+            <w:tcW w:type="dxa" w:w="6544"/>
             <w:vAlign w:val="center"/>
             <w:tcMar>
               <w:top w:w="90" w:type="dxa"/>
@@ -2134,7 +1838,7 @@
         </w:trPr>
         <w:tc>
           <w:tcPr>
-            <w:tcW w:type="dxa" w:w="1944"/>
+            <w:tcW w:type="dxa" w:w="1621"/>
             <w:vAlign w:val="center"/>
             <w:tcMar>
               <w:top w:w="90" w:type="dxa"/>
@@ -2142,7 +1846,6 @@
               <w:bottom w:w="90" w:type="dxa"/>
               <w:end w:w="100" w:type="dxa"/>
             </w:tcMar>
-            <w:shd w:fill="EAF2F8"/>
           </w:tcPr>
           <w:p>
             <w:pPr>
@@ -2160,7 +1863,7 @@
         </w:tc>
         <w:tc>
           <w:tcPr>
-            <w:tcW w:type="dxa" w:w="7848"/>
+            <w:tcW w:type="dxa" w:w="6544"/>
             <w:vAlign w:val="center"/>
             <w:tcMar>
               <w:top w:w="90" w:type="dxa"/>
@@ -2168,7 +1871,6 @@
               <w:bottom w:w="90" w:type="dxa"/>
               <w:end w:w="100" w:type="dxa"/>
             </w:tcMar>
-            <w:shd w:fill="EAF2F8"/>
           </w:tcPr>
           <w:p>
             <w:pPr>
@@ -2191,7 +1893,7 @@
         </w:trPr>
         <w:tc>
           <w:tcPr>
-            <w:tcW w:type="dxa" w:w="1944"/>
+            <w:tcW w:type="dxa" w:w="1621"/>
             <w:vAlign w:val="center"/>
             <w:tcMar>
               <w:top w:w="90" w:type="dxa"/>
@@ -2216,7 +1918,7 @@
         </w:tc>
         <w:tc>
           <w:tcPr>
-            <w:tcW w:type="dxa" w:w="7848"/>
+            <w:tcW w:type="dxa" w:w="6544"/>
             <w:vAlign w:val="center"/>
             <w:tcMar>
               <w:top w:w="90" w:type="dxa"/>
@@ -2246,7 +1948,7 @@
         </w:trPr>
         <w:tc>
           <w:tcPr>
-            <w:tcW w:type="dxa" w:w="1944"/>
+            <w:tcW w:type="dxa" w:w="1621"/>
             <w:vAlign w:val="center"/>
             <w:tcMar>
               <w:top w:w="90" w:type="dxa"/>
@@ -2254,7 +1956,6 @@
               <w:bottom w:w="90" w:type="dxa"/>
               <w:end w:w="100" w:type="dxa"/>
             </w:tcMar>
-            <w:shd w:fill="EAF2F8"/>
           </w:tcPr>
           <w:p>
             <w:pPr>
@@ -2272,7 +1973,7 @@
         </w:tc>
         <w:tc>
           <w:tcPr>
-            <w:tcW w:type="dxa" w:w="7848"/>
+            <w:tcW w:type="dxa" w:w="6544"/>
             <w:vAlign w:val="center"/>
             <w:tcMar>
               <w:top w:w="90" w:type="dxa"/>
@@ -2280,7 +1981,6 @@
               <w:bottom w:w="90" w:type="dxa"/>
               <w:end w:w="100" w:type="dxa"/>
             </w:tcMar>
-            <w:shd w:fill="EAF2F8"/>
           </w:tcPr>
           <w:p>
             <w:pPr>
@@ -2303,7 +2003,7 @@
         </w:trPr>
         <w:tc>
           <w:tcPr>
-            <w:tcW w:type="dxa" w:w="1944"/>
+            <w:tcW w:type="dxa" w:w="1621"/>
             <w:vAlign w:val="center"/>
             <w:tcMar>
               <w:top w:w="90" w:type="dxa"/>
@@ -2328,7 +2028,7 @@
         </w:tc>
         <w:tc>
           <w:tcPr>
-            <w:tcW w:type="dxa" w:w="7848"/>
+            <w:tcW w:type="dxa" w:w="6544"/>
             <w:vAlign w:val="center"/>
             <w:tcMar>
               <w:top w:w="90" w:type="dxa"/>
@@ -2358,7 +2058,7 @@
         </w:trPr>
         <w:tc>
           <w:tcPr>
-            <w:tcW w:type="dxa" w:w="1944"/>
+            <w:tcW w:type="dxa" w:w="1621"/>
             <w:vAlign w:val="center"/>
             <w:tcMar>
               <w:top w:w="90" w:type="dxa"/>
@@ -2366,7 +2066,6 @@
               <w:bottom w:w="90" w:type="dxa"/>
               <w:end w:w="100" w:type="dxa"/>
             </w:tcMar>
-            <w:shd w:fill="EAF2F8"/>
           </w:tcPr>
           <w:p>
             <w:pPr>
@@ -2384,7 +2083,7 @@
         </w:tc>
         <w:tc>
           <w:tcPr>
-            <w:tcW w:type="dxa" w:w="7848"/>
+            <w:tcW w:type="dxa" w:w="6544"/>
             <w:vAlign w:val="center"/>
             <w:tcMar>
               <w:top w:w="90" w:type="dxa"/>
@@ -2392,7 +2091,6 @@
               <w:bottom w:w="90" w:type="dxa"/>
               <w:end w:w="100" w:type="dxa"/>
             </w:tcMar>
-            <w:shd w:fill="EAF2F8"/>
           </w:tcPr>
           <w:p>
             <w:pPr>
@@ -2415,7 +2113,7 @@
         </w:trPr>
         <w:tc>
           <w:tcPr>
-            <w:tcW w:type="dxa" w:w="1944"/>
+            <w:tcW w:type="dxa" w:w="1621"/>
             <w:vAlign w:val="center"/>
             <w:tcMar>
               <w:top w:w="90" w:type="dxa"/>
@@ -2440,7 +2138,7 @@
         </w:tc>
         <w:tc>
           <w:tcPr>
-            <w:tcW w:type="dxa" w:w="7848"/>
+            <w:tcW w:type="dxa" w:w="6544"/>
             <w:vAlign w:val="center"/>
             <w:tcMar>
               <w:top w:w="90" w:type="dxa"/>
@@ -2495,8 +2193,8 @@
         <w:tblLook w:firstColumn="1" w:firstRow="1" w:lastColumn="0" w:lastRow="0" w:noHBand="0" w:noVBand="1" w:val="04A0"/>
       </w:tblPr>
       <w:tblGrid>
-        <w:gridCol w:w="4896"/>
-        <w:gridCol w:w="4896"/>
+        <w:gridCol w:w="4082"/>
+        <w:gridCol w:w="4082"/>
       </w:tblGrid>
       <w:tr>
         <w:trPr>
@@ -2505,8 +2203,7 @@
         </w:trPr>
         <w:tc>
           <w:tcPr>
-            <w:tcW w:type="dxa" w:w="2304"/>
-            <w:shd w:fill="1F4E78"/>
+            <w:tcW w:type="dxa" w:w="1921"/>
             <w:vAlign w:val="center"/>
             <w:tcMar>
               <w:top w:w="90" w:type="dxa"/>
@@ -2523,7 +2220,7 @@
               <w:rPr>
                 <w:rFonts w:ascii="Times New Roman" w:hAnsi="Times New Roman"/>
                 <w:b/>
-                <w:color w:val="FFFFFF"/>
+                <w:color w:val="000000"/>
                 <w:sz w:val="20"/>
               </w:rPr>
               <w:t>Layer</w:t>
@@ -2532,8 +2229,7 @@
         </w:tc>
         <w:tc>
           <w:tcPr>
-            <w:tcW w:type="dxa" w:w="7488"/>
-            <w:shd w:fill="1F4E78"/>
+            <w:tcW w:type="dxa" w:w="6244"/>
             <w:vAlign w:val="center"/>
             <w:tcMar>
               <w:top w:w="90" w:type="dxa"/>
@@ -2550,7 +2246,7 @@
               <w:rPr>
                 <w:rFonts w:ascii="Times New Roman" w:hAnsi="Times New Roman"/>
                 <w:b/>
-                <w:color w:val="FFFFFF"/>
+                <w:color w:val="000000"/>
                 <w:sz w:val="20"/>
               </w:rPr>
               <w:t>Documented technology</w:t>
@@ -2564,7 +2260,7 @@
         </w:trPr>
         <w:tc>
           <w:tcPr>
-            <w:tcW w:type="dxa" w:w="2304"/>
+            <w:tcW w:type="dxa" w:w="1921"/>
             <w:vAlign w:val="center"/>
             <w:tcMar>
               <w:top w:w="90" w:type="dxa"/>
@@ -2589,7 +2285,7 @@
         </w:tc>
         <w:tc>
           <w:tcPr>
-            <w:tcW w:type="dxa" w:w="7488"/>
+            <w:tcW w:type="dxa" w:w="6244"/>
             <w:vAlign w:val="center"/>
             <w:tcMar>
               <w:top w:w="90" w:type="dxa"/>
@@ -2619,7 +2315,7 @@
         </w:trPr>
         <w:tc>
           <w:tcPr>
-            <w:tcW w:type="dxa" w:w="2304"/>
+            <w:tcW w:type="dxa" w:w="1921"/>
             <w:vAlign w:val="center"/>
             <w:tcMar>
               <w:top w:w="90" w:type="dxa"/>
@@ -2627,7 +2323,6 @@
               <w:bottom w:w="90" w:type="dxa"/>
               <w:end w:w="100" w:type="dxa"/>
             </w:tcMar>
-            <w:shd w:fill="EAF2F8"/>
           </w:tcPr>
           <w:p>
             <w:pPr>
@@ -2645,7 +2340,7 @@
         </w:tc>
         <w:tc>
           <w:tcPr>
-            <w:tcW w:type="dxa" w:w="7488"/>
+            <w:tcW w:type="dxa" w:w="6244"/>
             <w:vAlign w:val="center"/>
             <w:tcMar>
               <w:top w:w="90" w:type="dxa"/>
@@ -2653,7 +2348,6 @@
               <w:bottom w:w="90" w:type="dxa"/>
               <w:end w:w="100" w:type="dxa"/>
             </w:tcMar>
-            <w:shd w:fill="EAF2F8"/>
           </w:tcPr>
           <w:p>
             <w:pPr>
@@ -2676,7 +2370,7 @@
         </w:trPr>
         <w:tc>
           <w:tcPr>
-            <w:tcW w:type="dxa" w:w="2304"/>
+            <w:tcW w:type="dxa" w:w="1921"/>
             <w:vAlign w:val="center"/>
             <w:tcMar>
               <w:top w:w="90" w:type="dxa"/>
@@ -2701,7 +2395,7 @@
         </w:tc>
         <w:tc>
           <w:tcPr>
-            <w:tcW w:type="dxa" w:w="7488"/>
+            <w:tcW w:type="dxa" w:w="6244"/>
             <w:vAlign w:val="center"/>
             <w:tcMar>
               <w:top w:w="90" w:type="dxa"/>
@@ -2731,7 +2425,7 @@
         </w:trPr>
         <w:tc>
           <w:tcPr>
-            <w:tcW w:type="dxa" w:w="2304"/>
+            <w:tcW w:type="dxa" w:w="1921"/>
             <w:vAlign w:val="center"/>
             <w:tcMar>
               <w:top w:w="90" w:type="dxa"/>
@@ -2739,7 +2433,6 @@
               <w:bottom w:w="90" w:type="dxa"/>
               <w:end w:w="100" w:type="dxa"/>
             </w:tcMar>
-            <w:shd w:fill="EAF2F8"/>
           </w:tcPr>
           <w:p>
             <w:pPr>
@@ -2757,7 +2450,7 @@
         </w:tc>
         <w:tc>
           <w:tcPr>
-            <w:tcW w:type="dxa" w:w="7488"/>
+            <w:tcW w:type="dxa" w:w="6244"/>
             <w:vAlign w:val="center"/>
             <w:tcMar>
               <w:top w:w="90" w:type="dxa"/>
@@ -2765,7 +2458,6 @@
               <w:bottom w:w="90" w:type="dxa"/>
               <w:end w:w="100" w:type="dxa"/>
             </w:tcMar>
-            <w:shd w:fill="EAF2F8"/>
           </w:tcPr>
           <w:p>
             <w:pPr>
@@ -2788,7 +2480,7 @@
         </w:trPr>
         <w:tc>
           <w:tcPr>
-            <w:tcW w:type="dxa" w:w="2304"/>
+            <w:tcW w:type="dxa" w:w="1921"/>
             <w:vAlign w:val="center"/>
             <w:tcMar>
               <w:top w:w="90" w:type="dxa"/>
@@ -2813,7 +2505,7 @@
         </w:tc>
         <w:tc>
           <w:tcPr>
-            <w:tcW w:type="dxa" w:w="7488"/>
+            <w:tcW w:type="dxa" w:w="6244"/>
             <w:vAlign w:val="center"/>
             <w:tcMar>
               <w:top w:w="90" w:type="dxa"/>
@@ -2843,7 +2535,7 @@
         </w:trPr>
         <w:tc>
           <w:tcPr>
-            <w:tcW w:type="dxa" w:w="2304"/>
+            <w:tcW w:type="dxa" w:w="1921"/>
             <w:vAlign w:val="center"/>
             <w:tcMar>
               <w:top w:w="90" w:type="dxa"/>
@@ -2851,7 +2543,6 @@
               <w:bottom w:w="90" w:type="dxa"/>
               <w:end w:w="100" w:type="dxa"/>
             </w:tcMar>
-            <w:shd w:fill="EAF2F8"/>
           </w:tcPr>
           <w:p>
             <w:pPr>
@@ -2869,7 +2560,7 @@
         </w:tc>
         <w:tc>
           <w:tcPr>
-            <w:tcW w:type="dxa" w:w="7488"/>
+            <w:tcW w:type="dxa" w:w="6244"/>
             <w:vAlign w:val="center"/>
             <w:tcMar>
               <w:top w:w="90" w:type="dxa"/>
@@ -2877,7 +2568,6 @@
               <w:bottom w:w="90" w:type="dxa"/>
               <w:end w:w="100" w:type="dxa"/>
             </w:tcMar>
-            <w:shd w:fill="EAF2F8"/>
           </w:tcPr>
           <w:p>
             <w:pPr>
@@ -2900,7 +2590,7 @@
         </w:trPr>
         <w:tc>
           <w:tcPr>
-            <w:tcW w:type="dxa" w:w="2304"/>
+            <w:tcW w:type="dxa" w:w="1921"/>
             <w:vAlign w:val="center"/>
             <w:tcMar>
               <w:top w:w="90" w:type="dxa"/>
@@ -2925,7 +2615,7 @@
         </w:tc>
         <w:tc>
           <w:tcPr>
-            <w:tcW w:type="dxa" w:w="7488"/>
+            <w:tcW w:type="dxa" w:w="6244"/>
             <w:vAlign w:val="center"/>
             <w:tcMar>
               <w:top w:w="90" w:type="dxa"/>
@@ -2955,7 +2645,7 @@
         </w:trPr>
         <w:tc>
           <w:tcPr>
-            <w:tcW w:type="dxa" w:w="2304"/>
+            <w:tcW w:type="dxa" w:w="1921"/>
             <w:vAlign w:val="center"/>
             <w:tcMar>
               <w:top w:w="90" w:type="dxa"/>
@@ -2963,7 +2653,6 @@
               <w:bottom w:w="90" w:type="dxa"/>
               <w:end w:w="100" w:type="dxa"/>
             </w:tcMar>
-            <w:shd w:fill="EAF2F8"/>
           </w:tcPr>
           <w:p>
             <w:pPr>
@@ -2981,7 +2670,7 @@
         </w:tc>
         <w:tc>
           <w:tcPr>
-            <w:tcW w:type="dxa" w:w="7488"/>
+            <w:tcW w:type="dxa" w:w="6244"/>
             <w:vAlign w:val="center"/>
             <w:tcMar>
               <w:top w:w="90" w:type="dxa"/>
@@ -2989,7 +2678,6 @@
               <w:bottom w:w="90" w:type="dxa"/>
               <w:end w:w="100" w:type="dxa"/>
             </w:tcMar>
-            <w:shd w:fill="EAF2F8"/>
           </w:tcPr>
           <w:p>
             <w:pPr>
@@ -3029,9 +2717,9 @@
         <w:tblLook w:firstColumn="1" w:firstRow="1" w:lastColumn="0" w:lastRow="0" w:noHBand="0" w:noVBand="1" w:val="04A0"/>
       </w:tblPr>
       <w:tblGrid>
-        <w:gridCol w:w="3264"/>
-        <w:gridCol w:w="3264"/>
-        <w:gridCol w:w="3264"/>
+        <w:gridCol w:w="2722"/>
+        <w:gridCol w:w="2722"/>
+        <w:gridCol w:w="2722"/>
       </w:tblGrid>
       <w:tr>
         <w:trPr>
@@ -3040,8 +2728,7 @@
         </w:trPr>
         <w:tc>
           <w:tcPr>
-            <w:tcW w:type="dxa" w:w="792"/>
-            <w:shd w:fill="1F4E78"/>
+            <w:tcW w:type="dxa" w:w="660"/>
             <w:vAlign w:val="center"/>
             <w:tcMar>
               <w:top w:w="90" w:type="dxa"/>
@@ -3058,7 +2745,7 @@
               <w:rPr>
                 <w:rFonts w:ascii="Times New Roman" w:hAnsi="Times New Roman"/>
                 <w:b/>
-                <w:color w:val="FFFFFF"/>
+                <w:color w:val="000000"/>
                 <w:sz w:val="20"/>
               </w:rPr>
               <w:t>Step</w:t>
@@ -3067,8 +2754,7 @@
         </w:tc>
         <w:tc>
           <w:tcPr>
-            <w:tcW w:type="dxa" w:w="4176"/>
-            <w:shd w:fill="1F4E78"/>
+            <w:tcW w:type="dxa" w:w="3482"/>
             <w:vAlign w:val="center"/>
             <w:tcMar>
               <w:top w:w="90" w:type="dxa"/>
@@ -3085,7 +2771,7 @@
               <w:rPr>
                 <w:rFonts w:ascii="Times New Roman" w:hAnsi="Times New Roman"/>
                 <w:b/>
-                <w:color w:val="FFFFFF"/>
+                <w:color w:val="000000"/>
                 <w:sz w:val="20"/>
               </w:rPr>
               <w:t>Action</w:t>
@@ -3094,8 +2780,7 @@
         </w:tc>
         <w:tc>
           <w:tcPr>
-            <w:tcW w:type="dxa" w:w="4824"/>
-            <w:shd w:fill="1F4E78"/>
+            <w:tcW w:type="dxa" w:w="4022"/>
             <w:vAlign w:val="center"/>
             <w:tcMar>
               <w:top w:w="90" w:type="dxa"/>
@@ -3112,7 +2797,7 @@
               <w:rPr>
                 <w:rFonts w:ascii="Times New Roman" w:hAnsi="Times New Roman"/>
                 <w:b/>
-                <w:color w:val="FFFFFF"/>
+                <w:color w:val="000000"/>
                 <w:sz w:val="20"/>
               </w:rPr>
               <w:t>Purpose</w:t>
@@ -3126,7 +2811,7 @@
         </w:trPr>
         <w:tc>
           <w:tcPr>
-            <w:tcW w:type="dxa" w:w="792"/>
+            <w:tcW w:type="dxa" w:w="660"/>
             <w:vAlign w:val="center"/>
             <w:tcMar>
               <w:top w:w="90" w:type="dxa"/>
@@ -3151,7 +2836,7 @@
         </w:tc>
         <w:tc>
           <w:tcPr>
-            <w:tcW w:type="dxa" w:w="4176"/>
+            <w:tcW w:type="dxa" w:w="3482"/>
             <w:vAlign w:val="center"/>
             <w:tcMar>
               <w:top w:w="90" w:type="dxa"/>
@@ -3176,7 +2861,7 @@
         </w:tc>
         <w:tc>
           <w:tcPr>
-            <w:tcW w:type="dxa" w:w="4824"/>
+            <w:tcW w:type="dxa" w:w="4022"/>
             <w:vAlign w:val="center"/>
             <w:tcMar>
               <w:top w:w="90" w:type="dxa"/>
@@ -3206,7 +2891,7 @@
         </w:trPr>
         <w:tc>
           <w:tcPr>
-            <w:tcW w:type="dxa" w:w="792"/>
+            <w:tcW w:type="dxa" w:w="660"/>
             <w:vAlign w:val="center"/>
             <w:tcMar>
               <w:top w:w="90" w:type="dxa"/>
@@ -3214,7 +2899,6 @@
               <w:bottom w:w="90" w:type="dxa"/>
               <w:end w:w="100" w:type="dxa"/>
             </w:tcMar>
-            <w:shd w:fill="EAF2F8"/>
           </w:tcPr>
           <w:p>
             <w:pPr>
@@ -3232,7 +2916,7 @@
         </w:tc>
         <w:tc>
           <w:tcPr>
-            <w:tcW w:type="dxa" w:w="4176"/>
+            <w:tcW w:type="dxa" w:w="3482"/>
             <w:vAlign w:val="center"/>
             <w:tcMar>
               <w:top w:w="90" w:type="dxa"/>
@@ -3240,7 +2924,6 @@
               <w:bottom w:w="90" w:type="dxa"/>
               <w:end w:w="100" w:type="dxa"/>
             </w:tcMar>
-            <w:shd w:fill="EAF2F8"/>
           </w:tcPr>
           <w:p>
             <w:pPr>
@@ -3258,7 +2941,7 @@
         </w:tc>
         <w:tc>
           <w:tcPr>
-            <w:tcW w:type="dxa" w:w="4824"/>
+            <w:tcW w:type="dxa" w:w="4022"/>
             <w:vAlign w:val="center"/>
             <w:tcMar>
               <w:top w:w="90" w:type="dxa"/>
@@ -3266,7 +2949,6 @@
               <w:bottom w:w="90" w:type="dxa"/>
               <w:end w:w="100" w:type="dxa"/>
             </w:tcMar>
-            <w:shd w:fill="EAF2F8"/>
           </w:tcPr>
           <w:p>
             <w:pPr>
@@ -3289,7 +2971,7 @@
         </w:trPr>
         <w:tc>
           <w:tcPr>
-            <w:tcW w:type="dxa" w:w="792"/>
+            <w:tcW w:type="dxa" w:w="660"/>
             <w:vAlign w:val="center"/>
             <w:tcMar>
               <w:top w:w="90" w:type="dxa"/>
@@ -3314,7 +2996,7 @@
         </w:tc>
         <w:tc>
           <w:tcPr>
-            <w:tcW w:type="dxa" w:w="4176"/>
+            <w:tcW w:type="dxa" w:w="3482"/>
             <w:vAlign w:val="center"/>
             <w:tcMar>
               <w:top w:w="90" w:type="dxa"/>
@@ -3339,7 +3021,7 @@
         </w:tc>
         <w:tc>
           <w:tcPr>
-            <w:tcW w:type="dxa" w:w="4824"/>
+            <w:tcW w:type="dxa" w:w="4022"/>
             <w:vAlign w:val="center"/>
             <w:tcMar>
               <w:top w:w="90" w:type="dxa"/>
@@ -3369,7 +3051,7 @@
         </w:trPr>
         <w:tc>
           <w:tcPr>
-            <w:tcW w:type="dxa" w:w="792"/>
+            <w:tcW w:type="dxa" w:w="660"/>
             <w:vAlign w:val="center"/>
             <w:tcMar>
               <w:top w:w="90" w:type="dxa"/>
@@ -3377,7 +3059,6 @@
               <w:bottom w:w="90" w:type="dxa"/>
               <w:end w:w="100" w:type="dxa"/>
             </w:tcMar>
-            <w:shd w:fill="EAF2F8"/>
           </w:tcPr>
           <w:p>
             <w:pPr>
@@ -3395,7 +3076,7 @@
         </w:tc>
         <w:tc>
           <w:tcPr>
-            <w:tcW w:type="dxa" w:w="4176"/>
+            <w:tcW w:type="dxa" w:w="3482"/>
             <w:vAlign w:val="center"/>
             <w:tcMar>
               <w:top w:w="90" w:type="dxa"/>
@@ -3403,7 +3084,6 @@
               <w:bottom w:w="90" w:type="dxa"/>
               <w:end w:w="100" w:type="dxa"/>
             </w:tcMar>
-            <w:shd w:fill="EAF2F8"/>
           </w:tcPr>
           <w:p>
             <w:pPr>
@@ -3421,7 +3101,7 @@
         </w:tc>
         <w:tc>
           <w:tcPr>
-            <w:tcW w:type="dxa" w:w="4824"/>
+            <w:tcW w:type="dxa" w:w="4022"/>
             <w:vAlign w:val="center"/>
             <w:tcMar>
               <w:top w:w="90" w:type="dxa"/>
@@ -3429,7 +3109,6 @@
               <w:bottom w:w="90" w:type="dxa"/>
               <w:end w:w="100" w:type="dxa"/>
             </w:tcMar>
-            <w:shd w:fill="EAF2F8"/>
           </w:tcPr>
           <w:p>
             <w:pPr>
@@ -3452,7 +3131,7 @@
         </w:trPr>
         <w:tc>
           <w:tcPr>
-            <w:tcW w:type="dxa" w:w="792"/>
+            <w:tcW w:type="dxa" w:w="660"/>
             <w:vAlign w:val="center"/>
             <w:tcMar>
               <w:top w:w="90" w:type="dxa"/>
@@ -3477,7 +3156,7 @@
         </w:tc>
         <w:tc>
           <w:tcPr>
-            <w:tcW w:type="dxa" w:w="4176"/>
+            <w:tcW w:type="dxa" w:w="3482"/>
             <w:vAlign w:val="center"/>
             <w:tcMar>
               <w:top w:w="90" w:type="dxa"/>
@@ -3502,7 +3181,7 @@
         </w:tc>
         <w:tc>
           <w:tcPr>
-            <w:tcW w:type="dxa" w:w="4824"/>
+            <w:tcW w:type="dxa" w:w="4022"/>
             <w:vAlign w:val="center"/>
             <w:tcMar>
               <w:top w:w="90" w:type="dxa"/>
@@ -3532,7 +3211,7 @@
         </w:trPr>
         <w:tc>
           <w:tcPr>
-            <w:tcW w:type="dxa" w:w="792"/>
+            <w:tcW w:type="dxa" w:w="660"/>
             <w:vAlign w:val="center"/>
             <w:tcMar>
               <w:top w:w="90" w:type="dxa"/>
@@ -3540,7 +3219,6 @@
               <w:bottom w:w="90" w:type="dxa"/>
               <w:end w:w="100" w:type="dxa"/>
             </w:tcMar>
-            <w:shd w:fill="EAF2F8"/>
           </w:tcPr>
           <w:p>
             <w:pPr>
@@ -3558,7 +3236,7 @@
         </w:tc>
         <w:tc>
           <w:tcPr>
-            <w:tcW w:type="dxa" w:w="4176"/>
+            <w:tcW w:type="dxa" w:w="3482"/>
             <w:vAlign w:val="center"/>
             <w:tcMar>
               <w:top w:w="90" w:type="dxa"/>
@@ -3566,7 +3244,6 @@
               <w:bottom w:w="90" w:type="dxa"/>
               <w:end w:w="100" w:type="dxa"/>
             </w:tcMar>
-            <w:shd w:fill="EAF2F8"/>
           </w:tcPr>
           <w:p>
             <w:pPr>
@@ -3584,7 +3261,7 @@
         </w:tc>
         <w:tc>
           <w:tcPr>
-            <w:tcW w:type="dxa" w:w="4824"/>
+            <w:tcW w:type="dxa" w:w="4022"/>
             <w:vAlign w:val="center"/>
             <w:tcMar>
               <w:top w:w="90" w:type="dxa"/>
@@ -3592,7 +3269,6 @@
               <w:bottom w:w="90" w:type="dxa"/>
               <w:end w:w="100" w:type="dxa"/>
             </w:tcMar>
-            <w:shd w:fill="EAF2F8"/>
           </w:tcPr>
           <w:p>
             <w:pPr>
@@ -3615,7 +3291,7 @@
         </w:trPr>
         <w:tc>
           <w:tcPr>
-            <w:tcW w:type="dxa" w:w="792"/>
+            <w:tcW w:type="dxa" w:w="660"/>
             <w:vAlign w:val="center"/>
             <w:tcMar>
               <w:top w:w="90" w:type="dxa"/>
@@ -3640,7 +3316,7 @@
         </w:tc>
         <w:tc>
           <w:tcPr>
-            <w:tcW w:type="dxa" w:w="4176"/>
+            <w:tcW w:type="dxa" w:w="3482"/>
             <w:vAlign w:val="center"/>
             <w:tcMar>
               <w:top w:w="90" w:type="dxa"/>
@@ -3665,7 +3341,7 @@
         </w:tc>
         <w:tc>
           <w:tcPr>
-            <w:tcW w:type="dxa" w:w="4824"/>
+            <w:tcW w:type="dxa" w:w="4022"/>
             <w:vAlign w:val="center"/>
             <w:tcMar>
               <w:top w:w="90" w:type="dxa"/>
@@ -3695,7 +3371,7 @@
         </w:trPr>
         <w:tc>
           <w:tcPr>
-            <w:tcW w:type="dxa" w:w="792"/>
+            <w:tcW w:type="dxa" w:w="660"/>
             <w:vAlign w:val="center"/>
             <w:tcMar>
               <w:top w:w="90" w:type="dxa"/>
@@ -3703,7 +3379,6 @@
               <w:bottom w:w="90" w:type="dxa"/>
               <w:end w:w="100" w:type="dxa"/>
             </w:tcMar>
-            <w:shd w:fill="EAF2F8"/>
           </w:tcPr>
           <w:p>
             <w:pPr>
@@ -3721,7 +3396,7 @@
         </w:tc>
         <w:tc>
           <w:tcPr>
-            <w:tcW w:type="dxa" w:w="4176"/>
+            <w:tcW w:type="dxa" w:w="3482"/>
             <w:vAlign w:val="center"/>
             <w:tcMar>
               <w:top w:w="90" w:type="dxa"/>
@@ -3729,7 +3404,6 @@
               <w:bottom w:w="90" w:type="dxa"/>
               <w:end w:w="100" w:type="dxa"/>
             </w:tcMar>
-            <w:shd w:fill="EAF2F8"/>
           </w:tcPr>
           <w:p>
             <w:pPr>
@@ -3747,7 +3421,7 @@
         </w:tc>
         <w:tc>
           <w:tcPr>
-            <w:tcW w:type="dxa" w:w="4824"/>
+            <w:tcW w:type="dxa" w:w="4022"/>
             <w:vAlign w:val="center"/>
             <w:tcMar>
               <w:top w:w="90" w:type="dxa"/>
@@ -3755,7 +3429,6 @@
               <w:bottom w:w="90" w:type="dxa"/>
               <w:end w:w="100" w:type="dxa"/>
             </w:tcMar>
-            <w:shd w:fill="EAF2F8"/>
           </w:tcPr>
           <w:p>
             <w:pPr>
@@ -4358,12 +4031,12 @@
         <w:tblLook w:firstColumn="1" w:firstRow="1" w:lastColumn="0" w:lastRow="0" w:noHBand="0" w:noVBand="1" w:val="04A0"/>
       </w:tblPr>
       <w:tblGrid>
-        <w:gridCol w:w="1632"/>
-        <w:gridCol w:w="1632"/>
-        <w:gridCol w:w="1632"/>
-        <w:gridCol w:w="1632"/>
-        <w:gridCol w:w="1632"/>
-        <w:gridCol w:w="1632"/>
+        <w:gridCol w:w="1361"/>
+        <w:gridCol w:w="1361"/>
+        <w:gridCol w:w="1361"/>
+        <w:gridCol w:w="1361"/>
+        <w:gridCol w:w="1361"/>
+        <w:gridCol w:w="1361"/>
       </w:tblGrid>
       <w:tr>
         <w:trPr>
@@ -4372,8 +4045,7 @@
         </w:trPr>
         <w:tc>
           <w:tcPr>
-            <w:tcW w:type="dxa" w:w="1800"/>
-            <w:shd w:fill="1F4E78"/>
+            <w:tcW w:type="dxa" w:w="1620"/>
             <w:vAlign w:val="center"/>
             <w:tcMar>
               <w:top w:w="90" w:type="dxa"/>
@@ -4390,7 +4062,7 @@
               <w:rPr>
                 <w:rFonts w:ascii="Times New Roman" w:hAnsi="Times New Roman"/>
                 <w:b/>
-                <w:color w:val="FFFFFF"/>
+                <w:color w:val="000000"/>
                 <w:sz w:val="20"/>
               </w:rPr>
               <w:t>Model</w:t>
@@ -4399,8 +4071,7 @@
         </w:tc>
         <w:tc>
           <w:tcPr>
-            <w:tcW w:type="dxa" w:w="1440"/>
-            <w:shd w:fill="1F4E78"/>
+            <w:tcW w:type="dxa" w:w="1296"/>
             <w:vAlign w:val="center"/>
             <w:tcMar>
               <w:top w:w="90" w:type="dxa"/>
@@ -4417,7 +4088,7 @@
               <w:rPr>
                 <w:rFonts w:ascii="Times New Roman" w:hAnsi="Times New Roman"/>
                 <w:b/>
-                <w:color w:val="FFFFFF"/>
+                <w:color w:val="000000"/>
                 <w:sz w:val="20"/>
               </w:rPr>
               <w:t>Accuracy</w:t>
@@ -4426,8 +4097,7 @@
         </w:tc>
         <w:tc>
           <w:tcPr>
-            <w:tcW w:type="dxa" w:w="1440"/>
-            <w:shd w:fill="1F4E78"/>
+            <w:tcW w:type="dxa" w:w="1296"/>
             <w:vAlign w:val="center"/>
             <w:tcMar>
               <w:top w:w="90" w:type="dxa"/>
@@ -4444,7 +4114,7 @@
               <w:rPr>
                 <w:rFonts w:ascii="Times New Roman" w:hAnsi="Times New Roman"/>
                 <w:b/>
-                <w:color w:val="FFFFFF"/>
+                <w:color w:val="000000"/>
                 <w:sz w:val="20"/>
               </w:rPr>
               <w:t>Precision</w:t>
@@ -4453,8 +4123,7 @@
         </w:tc>
         <w:tc>
           <w:tcPr>
-            <w:tcW w:type="dxa" w:w="1440"/>
-            <w:shd w:fill="1F4E78"/>
+            <w:tcW w:type="dxa" w:w="1296"/>
             <w:vAlign w:val="center"/>
             <w:tcMar>
               <w:top w:w="90" w:type="dxa"/>
@@ -4471,7 +4140,7 @@
               <w:rPr>
                 <w:rFonts w:ascii="Times New Roman" w:hAnsi="Times New Roman"/>
                 <w:b/>
-                <w:color w:val="FFFFFF"/>
+                <w:color w:val="000000"/>
                 <w:sz w:val="20"/>
               </w:rPr>
               <w:t>Recall</w:t>
@@ -4480,8 +4149,7 @@
         </w:tc>
         <w:tc>
           <w:tcPr>
-            <w:tcW w:type="dxa" w:w="1440"/>
-            <w:shd w:fill="1F4E78"/>
+            <w:tcW w:type="dxa" w:w="1296"/>
             <w:vAlign w:val="center"/>
             <w:tcMar>
               <w:top w:w="90" w:type="dxa"/>
@@ -4498,7 +4166,7 @@
               <w:rPr>
                 <w:rFonts w:ascii="Times New Roman" w:hAnsi="Times New Roman"/>
                 <w:b/>
-                <w:color w:val="FFFFFF"/>
+                <w:color w:val="000000"/>
                 <w:sz w:val="20"/>
               </w:rPr>
               <w:t>F1 score</w:t>
@@ -4507,8 +4175,7 @@
         </w:tc>
         <w:tc>
           <w:tcPr>
-            <w:tcW w:type="dxa" w:w="1512"/>
-            <w:shd w:fill="1F4E78"/>
+            <w:tcW w:type="dxa" w:w="1361"/>
             <w:vAlign w:val="center"/>
             <w:tcMar>
               <w:top w:w="90" w:type="dxa"/>
@@ -4525,7 +4192,7 @@
               <w:rPr>
                 <w:rFonts w:ascii="Times New Roman" w:hAnsi="Times New Roman"/>
                 <w:b/>
-                <w:color w:val="FFFFFF"/>
+                <w:color w:val="000000"/>
                 <w:sz w:val="20"/>
               </w:rPr>
               <w:t>ROC AUC</w:t>
@@ -4539,7 +4206,7 @@
         </w:trPr>
         <w:tc>
           <w:tcPr>
-            <w:tcW w:type="dxa" w:w="1800"/>
+            <w:tcW w:type="dxa" w:w="1620"/>
             <w:vAlign w:val="center"/>
             <w:tcMar>
               <w:top w:w="90" w:type="dxa"/>
@@ -4564,7 +4231,7 @@
         </w:tc>
         <w:tc>
           <w:tcPr>
-            <w:tcW w:type="dxa" w:w="1440"/>
+            <w:tcW w:type="dxa" w:w="1296"/>
             <w:vAlign w:val="center"/>
             <w:tcMar>
               <w:top w:w="90" w:type="dxa"/>
@@ -4589,7 +4256,7 @@
         </w:tc>
         <w:tc>
           <w:tcPr>
-            <w:tcW w:type="dxa" w:w="1440"/>
+            <w:tcW w:type="dxa" w:w="1296"/>
             <w:vAlign w:val="center"/>
             <w:tcMar>
               <w:top w:w="90" w:type="dxa"/>
@@ -4614,7 +4281,7 @@
         </w:tc>
         <w:tc>
           <w:tcPr>
-            <w:tcW w:type="dxa" w:w="1440"/>
+            <w:tcW w:type="dxa" w:w="1296"/>
             <w:vAlign w:val="center"/>
             <w:tcMar>
               <w:top w:w="90" w:type="dxa"/>
@@ -4639,7 +4306,7 @@
         </w:tc>
         <w:tc>
           <w:tcPr>
-            <w:tcW w:type="dxa" w:w="1440"/>
+            <w:tcW w:type="dxa" w:w="1296"/>
             <w:vAlign w:val="center"/>
             <w:tcMar>
               <w:top w:w="90" w:type="dxa"/>
@@ -4664,7 +4331,7 @@
         </w:tc>
         <w:tc>
           <w:tcPr>
-            <w:tcW w:type="dxa" w:w="1512"/>
+            <w:tcW w:type="dxa" w:w="1361"/>
             <w:vAlign w:val="center"/>
             <w:tcMar>
               <w:top w:w="90" w:type="dxa"/>
@@ -4694,7 +4361,7 @@
         </w:trPr>
         <w:tc>
           <w:tcPr>
-            <w:tcW w:type="dxa" w:w="1800"/>
+            <w:tcW w:type="dxa" w:w="1620"/>
             <w:vAlign w:val="center"/>
             <w:tcMar>
               <w:top w:w="90" w:type="dxa"/>
@@ -4702,7 +4369,6 @@
               <w:bottom w:w="90" w:type="dxa"/>
               <w:end w:w="100" w:type="dxa"/>
             </w:tcMar>
-            <w:shd w:fill="EAF2F8"/>
           </w:tcPr>
           <w:p>
             <w:pPr>
@@ -4720,7 +4386,7 @@
         </w:tc>
         <w:tc>
           <w:tcPr>
-            <w:tcW w:type="dxa" w:w="1440"/>
+            <w:tcW w:type="dxa" w:w="1296"/>
             <w:vAlign w:val="center"/>
             <w:tcMar>
               <w:top w:w="90" w:type="dxa"/>
@@ -4728,7 +4394,6 @@
               <w:bottom w:w="90" w:type="dxa"/>
               <w:end w:w="100" w:type="dxa"/>
             </w:tcMar>
-            <w:shd w:fill="EAF2F8"/>
           </w:tcPr>
           <w:p>
             <w:pPr>
@@ -4746,7 +4411,7 @@
         </w:tc>
         <w:tc>
           <w:tcPr>
-            <w:tcW w:type="dxa" w:w="1440"/>
+            <w:tcW w:type="dxa" w:w="1296"/>
             <w:vAlign w:val="center"/>
             <w:tcMar>
               <w:top w:w="90" w:type="dxa"/>
@@ -4754,7 +4419,6 @@
               <w:bottom w:w="90" w:type="dxa"/>
               <w:end w:w="100" w:type="dxa"/>
             </w:tcMar>
-            <w:shd w:fill="EAF2F8"/>
           </w:tcPr>
           <w:p>
             <w:pPr>
@@ -4772,7 +4436,7 @@
         </w:tc>
         <w:tc>
           <w:tcPr>
-            <w:tcW w:type="dxa" w:w="1440"/>
+            <w:tcW w:type="dxa" w:w="1296"/>
             <w:vAlign w:val="center"/>
             <w:tcMar>
               <w:top w:w="90" w:type="dxa"/>
@@ -4780,7 +4444,6 @@
               <w:bottom w:w="90" w:type="dxa"/>
               <w:end w:w="100" w:type="dxa"/>
             </w:tcMar>
-            <w:shd w:fill="EAF2F8"/>
           </w:tcPr>
           <w:p>
             <w:pPr>
@@ -4798,7 +4461,7 @@
         </w:tc>
         <w:tc>
           <w:tcPr>
-            <w:tcW w:type="dxa" w:w="1440"/>
+            <w:tcW w:type="dxa" w:w="1296"/>
             <w:vAlign w:val="center"/>
             <w:tcMar>
               <w:top w:w="90" w:type="dxa"/>
@@ -4806,7 +4469,6 @@
               <w:bottom w:w="90" w:type="dxa"/>
               <w:end w:w="100" w:type="dxa"/>
             </w:tcMar>
-            <w:shd w:fill="EAF2F8"/>
           </w:tcPr>
           <w:p>
             <w:pPr>
@@ -4824,7 +4486,7 @@
         </w:tc>
         <w:tc>
           <w:tcPr>
-            <w:tcW w:type="dxa" w:w="1512"/>
+            <w:tcW w:type="dxa" w:w="1361"/>
             <w:vAlign w:val="center"/>
             <w:tcMar>
               <w:top w:w="90" w:type="dxa"/>
@@ -4832,7 +4494,6 @@
               <w:bottom w:w="90" w:type="dxa"/>
               <w:end w:w="100" w:type="dxa"/>
             </w:tcMar>
-            <w:shd w:fill="EAF2F8"/>
           </w:tcPr>
           <w:p>
             <w:pPr>
@@ -4855,7 +4516,7 @@
         </w:trPr>
         <w:tc>
           <w:tcPr>
-            <w:tcW w:type="dxa" w:w="1800"/>
+            <w:tcW w:type="dxa" w:w="1620"/>
             <w:vAlign w:val="center"/>
             <w:tcMar>
               <w:top w:w="90" w:type="dxa"/>
@@ -4880,7 +4541,7 @@
         </w:tc>
         <w:tc>
           <w:tcPr>
-            <w:tcW w:type="dxa" w:w="1440"/>
+            <w:tcW w:type="dxa" w:w="1296"/>
             <w:vAlign w:val="center"/>
             <w:tcMar>
               <w:top w:w="90" w:type="dxa"/>
@@ -4905,7 +4566,7 @@
         </w:tc>
         <w:tc>
           <w:tcPr>
-            <w:tcW w:type="dxa" w:w="1440"/>
+            <w:tcW w:type="dxa" w:w="1296"/>
             <w:vAlign w:val="center"/>
             <w:tcMar>
               <w:top w:w="90" w:type="dxa"/>
@@ -4930,7 +4591,7 @@
         </w:tc>
         <w:tc>
           <w:tcPr>
-            <w:tcW w:type="dxa" w:w="1440"/>
+            <w:tcW w:type="dxa" w:w="1296"/>
             <w:vAlign w:val="center"/>
             <w:tcMar>
               <w:top w:w="90" w:type="dxa"/>
@@ -4955,7 +4616,7 @@
         </w:tc>
         <w:tc>
           <w:tcPr>
-            <w:tcW w:type="dxa" w:w="1440"/>
+            <w:tcW w:type="dxa" w:w="1296"/>
             <w:vAlign w:val="center"/>
             <w:tcMar>
               <w:top w:w="90" w:type="dxa"/>
@@ -4980,7 +4641,7 @@
         </w:tc>
         <w:tc>
           <w:tcPr>
-            <w:tcW w:type="dxa" w:w="1512"/>
+            <w:tcW w:type="dxa" w:w="1361"/>
             <w:vAlign w:val="center"/>
             <w:tcMar>
               <w:top w:w="90" w:type="dxa"/>
@@ -5045,9 +4706,9 @@
         <w:tblLook w:firstColumn="1" w:firstRow="1" w:lastColumn="0" w:lastRow="0" w:noHBand="0" w:noVBand="1" w:val="04A0"/>
       </w:tblPr>
       <w:tblGrid>
-        <w:gridCol w:w="3264"/>
-        <w:gridCol w:w="3264"/>
-        <w:gridCol w:w="3264"/>
+        <w:gridCol w:w="2722"/>
+        <w:gridCol w:w="2722"/>
+        <w:gridCol w:w="2722"/>
       </w:tblGrid>
       <w:tr>
         <w:trPr>
@@ -5056,8 +4717,7 @@
         </w:trPr>
         <w:tc>
           <w:tcPr>
-            <w:tcW w:type="dxa" w:w="1872"/>
-            <w:shd w:fill="1F4E78"/>
+            <w:tcW w:type="dxa" w:w="1561"/>
             <w:vAlign w:val="center"/>
             <w:tcMar>
               <w:top w:w="90" w:type="dxa"/>
@@ -5074,7 +4734,7 @@
               <w:rPr>
                 <w:rFonts w:ascii="Times New Roman" w:hAnsi="Times New Roman"/>
                 <w:b/>
-                <w:color w:val="FFFFFF"/>
+                <w:color w:val="000000"/>
                 <w:sz w:val="20"/>
               </w:rPr>
               <w:t>Area</w:t>
@@ -5083,8 +4743,7 @@
         </w:tc>
         <w:tc>
           <w:tcPr>
-            <w:tcW w:type="dxa" w:w="3240"/>
-            <w:shd w:fill="1F4E78"/>
+            <w:tcW w:type="dxa" w:w="2702"/>
             <w:vAlign w:val="center"/>
             <w:tcMar>
               <w:top w:w="90" w:type="dxa"/>
@@ -5101,7 +4760,7 @@
               <w:rPr>
                 <w:rFonts w:ascii="Times New Roman" w:hAnsi="Times New Roman"/>
                 <w:b/>
-                <w:color w:val="FFFFFF"/>
+                <w:color w:val="000000"/>
                 <w:sz w:val="20"/>
               </w:rPr>
               <w:t>Evidence reviewed</w:t>
@@ -5110,8 +4769,7 @@
         </w:tc>
         <w:tc>
           <w:tcPr>
-            <w:tcW w:type="dxa" w:w="4680"/>
-            <w:shd w:fill="1F4E78"/>
+            <w:tcW w:type="dxa" w:w="3902"/>
             <w:vAlign w:val="center"/>
             <w:tcMar>
               <w:top w:w="90" w:type="dxa"/>
@@ -5128,7 +4786,7 @@
               <w:rPr>
                 <w:rFonts w:ascii="Times New Roman" w:hAnsi="Times New Roman"/>
                 <w:b/>
-                <w:color w:val="FFFFFF"/>
+                <w:color w:val="000000"/>
                 <w:sz w:val="20"/>
               </w:rPr>
               <w:t>Current conclusion</w:t>
@@ -5142,7 +4800,7 @@
         </w:trPr>
         <w:tc>
           <w:tcPr>
-            <w:tcW w:type="dxa" w:w="1872"/>
+            <w:tcW w:type="dxa" w:w="1561"/>
             <w:vAlign w:val="center"/>
             <w:tcMar>
               <w:top w:w="90" w:type="dxa"/>
@@ -5167,7 +4825,7 @@
         </w:tc>
         <w:tc>
           <w:tcPr>
-            <w:tcW w:type="dxa" w:w="3240"/>
+            <w:tcW w:type="dxa" w:w="2702"/>
             <w:vAlign w:val="center"/>
             <w:tcMar>
               <w:top w:w="90" w:type="dxa"/>
@@ -5192,7 +4850,7 @@
         </w:tc>
         <w:tc>
           <w:tcPr>
-            <w:tcW w:type="dxa" w:w="4680"/>
+            <w:tcW w:type="dxa" w:w="3902"/>
             <w:vAlign w:val="center"/>
             <w:tcMar>
               <w:top w:w="90" w:type="dxa"/>
@@ -5222,7 +4880,7 @@
         </w:trPr>
         <w:tc>
           <w:tcPr>
-            <w:tcW w:type="dxa" w:w="1872"/>
+            <w:tcW w:type="dxa" w:w="1561"/>
             <w:vAlign w:val="center"/>
             <w:tcMar>
               <w:top w:w="90" w:type="dxa"/>
@@ -5230,7 +4888,6 @@
               <w:bottom w:w="90" w:type="dxa"/>
               <w:end w:w="100" w:type="dxa"/>
             </w:tcMar>
-            <w:shd w:fill="EAF2F8"/>
           </w:tcPr>
           <w:p>
             <w:pPr>
@@ -5248,7 +4905,7 @@
         </w:tc>
         <w:tc>
           <w:tcPr>
-            <w:tcW w:type="dxa" w:w="3240"/>
+            <w:tcW w:type="dxa" w:w="2702"/>
             <w:vAlign w:val="center"/>
             <w:tcMar>
               <w:top w:w="90" w:type="dxa"/>
@@ -5256,7 +4913,6 @@
               <w:bottom w:w="90" w:type="dxa"/>
               <w:end w:w="100" w:type="dxa"/>
             </w:tcMar>
-            <w:shd w:fill="EAF2F8"/>
           </w:tcPr>
           <w:p>
             <w:pPr>
@@ -5274,7 +4930,7 @@
         </w:tc>
         <w:tc>
           <w:tcPr>
-            <w:tcW w:type="dxa" w:w="4680"/>
+            <w:tcW w:type="dxa" w:w="3902"/>
             <w:vAlign w:val="center"/>
             <w:tcMar>
               <w:top w:w="90" w:type="dxa"/>
@@ -5282,7 +4938,6 @@
               <w:bottom w:w="90" w:type="dxa"/>
               <w:end w:w="100" w:type="dxa"/>
             </w:tcMar>
-            <w:shd w:fill="EAF2F8"/>
           </w:tcPr>
           <w:p>
             <w:pPr>
@@ -5305,7 +4960,7 @@
         </w:trPr>
         <w:tc>
           <w:tcPr>
-            <w:tcW w:type="dxa" w:w="1872"/>
+            <w:tcW w:type="dxa" w:w="1561"/>
             <w:vAlign w:val="center"/>
             <w:tcMar>
               <w:top w:w="90" w:type="dxa"/>
@@ -5330,7 +4985,7 @@
         </w:tc>
         <w:tc>
           <w:tcPr>
-            <w:tcW w:type="dxa" w:w="3240"/>
+            <w:tcW w:type="dxa" w:w="2702"/>
             <w:vAlign w:val="center"/>
             <w:tcMar>
               <w:top w:w="90" w:type="dxa"/>
@@ -5355,7 +5010,7 @@
         </w:tc>
         <w:tc>
           <w:tcPr>
-            <w:tcW w:type="dxa" w:w="4680"/>
+            <w:tcW w:type="dxa" w:w="3902"/>
             <w:vAlign w:val="center"/>
             <w:tcMar>
               <w:top w:w="90" w:type="dxa"/>
@@ -5385,7 +5040,7 @@
         </w:trPr>
         <w:tc>
           <w:tcPr>
-            <w:tcW w:type="dxa" w:w="1872"/>
+            <w:tcW w:type="dxa" w:w="1561"/>
             <w:vAlign w:val="center"/>
             <w:tcMar>
               <w:top w:w="90" w:type="dxa"/>
@@ -5393,7 +5048,6 @@
               <w:bottom w:w="90" w:type="dxa"/>
               <w:end w:w="100" w:type="dxa"/>
             </w:tcMar>
-            <w:shd w:fill="EAF2F8"/>
           </w:tcPr>
           <w:p>
             <w:pPr>
@@ -5411,7 +5065,7 @@
         </w:tc>
         <w:tc>
           <w:tcPr>
-            <w:tcW w:type="dxa" w:w="3240"/>
+            <w:tcW w:type="dxa" w:w="2702"/>
             <w:vAlign w:val="center"/>
             <w:tcMar>
               <w:top w:w="90" w:type="dxa"/>
@@ -5419,7 +5073,6 @@
               <w:bottom w:w="90" w:type="dxa"/>
               <w:end w:w="100" w:type="dxa"/>
             </w:tcMar>
-            <w:shd w:fill="EAF2F8"/>
           </w:tcPr>
           <w:p>
             <w:pPr>
@@ -5437,7 +5090,7 @@
         </w:tc>
         <w:tc>
           <w:tcPr>
-            <w:tcW w:type="dxa" w:w="4680"/>
+            <w:tcW w:type="dxa" w:w="3902"/>
             <w:vAlign w:val="center"/>
             <w:tcMar>
               <w:top w:w="90" w:type="dxa"/>
@@ -5445,7 +5098,6 @@
               <w:bottom w:w="90" w:type="dxa"/>
               <w:end w:w="100" w:type="dxa"/>
             </w:tcMar>
-            <w:shd w:fill="EAF2F8"/>
           </w:tcPr>
           <w:p>
             <w:pPr>
@@ -5468,7 +5120,7 @@
         </w:trPr>
         <w:tc>
           <w:tcPr>
-            <w:tcW w:type="dxa" w:w="1872"/>
+            <w:tcW w:type="dxa" w:w="1561"/>
             <w:vAlign w:val="center"/>
             <w:tcMar>
               <w:top w:w="90" w:type="dxa"/>
@@ -5493,7 +5145,7 @@
         </w:tc>
         <w:tc>
           <w:tcPr>
-            <w:tcW w:type="dxa" w:w="3240"/>
+            <w:tcW w:type="dxa" w:w="2702"/>
             <w:vAlign w:val="center"/>
             <w:tcMar>
               <w:top w:w="90" w:type="dxa"/>
@@ -5518,7 +5170,7 @@
         </w:tc>
         <w:tc>
           <w:tcPr>
-            <w:tcW w:type="dxa" w:w="4680"/>
+            <w:tcW w:type="dxa" w:w="3902"/>
             <w:vAlign w:val="center"/>
             <w:tcMar>
               <w:top w:w="90" w:type="dxa"/>
@@ -5638,9 +5290,9 @@
         <w:tblLook w:firstColumn="1" w:firstRow="1" w:lastColumn="0" w:lastRow="0" w:noHBand="0" w:noVBand="1" w:val="04A0"/>
       </w:tblPr>
       <w:tblGrid>
-        <w:gridCol w:w="3264"/>
-        <w:gridCol w:w="3264"/>
-        <w:gridCol w:w="3264"/>
+        <w:gridCol w:w="2722"/>
+        <w:gridCol w:w="2722"/>
+        <w:gridCol w:w="2722"/>
       </w:tblGrid>
       <w:tr>
         <w:trPr>
@@ -5649,8 +5301,7 @@
         </w:trPr>
         <w:tc>
           <w:tcPr>
-            <w:tcW w:type="dxa" w:w="2292"/>
-            <w:shd w:fill="1F4E78"/>
+            <w:tcW w:type="dxa" w:w="1911"/>
             <w:vAlign w:val="center"/>
             <w:tcMar>
               <w:top w:w="90" w:type="dxa"/>
@@ -5667,7 +5318,7 @@
               <w:rPr>
                 <w:rFonts w:ascii="Times New Roman" w:hAnsi="Times New Roman"/>
                 <w:b/>
-                <w:color w:val="FFFFFF"/>
+                <w:color w:val="000000"/>
                 <w:sz w:val="20"/>
               </w:rPr>
               <w:t>Challenge</w:t>
@@ -5676,8 +5327,7 @@
         </w:tc>
         <w:tc>
           <w:tcPr>
-            <w:tcW w:type="dxa" w:w="3681"/>
-            <w:shd w:fill="1F4E78"/>
+            <w:tcW w:type="dxa" w:w="3069"/>
             <w:vAlign w:val="center"/>
             <w:tcMar>
               <w:top w:w="90" w:type="dxa"/>
@@ -5694,7 +5344,7 @@
               <w:rPr>
                 <w:rFonts w:ascii="Times New Roman" w:hAnsi="Times New Roman"/>
                 <w:b/>
-                <w:color w:val="FFFFFF"/>
+                <w:color w:val="000000"/>
                 <w:sz w:val="20"/>
               </w:rPr>
               <w:t>Response</w:t>
@@ -5703,8 +5353,7 @@
         </w:tc>
         <w:tc>
           <w:tcPr>
-            <w:tcW w:type="dxa" w:w="3820"/>
-            <w:shd w:fill="1F4E78"/>
+            <w:tcW w:type="dxa" w:w="3185"/>
             <w:vAlign w:val="center"/>
             <w:tcMar>
               <w:top w:w="90" w:type="dxa"/>
@@ -5721,7 +5370,7 @@
               <w:rPr>
                 <w:rFonts w:ascii="Times New Roman" w:hAnsi="Times New Roman"/>
                 <w:b/>
-                <w:color w:val="FFFFFF"/>
+                <w:color w:val="000000"/>
                 <w:sz w:val="20"/>
               </w:rPr>
               <w:t>Remaining work</w:t>
@@ -5735,7 +5384,7 @@
         </w:trPr>
         <w:tc>
           <w:tcPr>
-            <w:tcW w:type="dxa" w:w="2292"/>
+            <w:tcW w:type="dxa" w:w="1911"/>
             <w:vAlign w:val="center"/>
             <w:tcMar>
               <w:top w:w="90" w:type="dxa"/>
@@ -5760,7 +5409,7 @@
         </w:tc>
         <w:tc>
           <w:tcPr>
-            <w:tcW w:type="dxa" w:w="3681"/>
+            <w:tcW w:type="dxa" w:w="3069"/>
             <w:vAlign w:val="center"/>
             <w:tcMar>
               <w:top w:w="90" w:type="dxa"/>
@@ -5785,7 +5434,7 @@
         </w:tc>
         <w:tc>
           <w:tcPr>
-            <w:tcW w:type="dxa" w:w="3820"/>
+            <w:tcW w:type="dxa" w:w="3185"/>
             <w:vAlign w:val="center"/>
             <w:tcMar>
               <w:top w:w="90" w:type="dxa"/>
@@ -5815,7 +5464,7 @@
         </w:trPr>
         <w:tc>
           <w:tcPr>
-            <w:tcW w:type="dxa" w:w="2292"/>
+            <w:tcW w:type="dxa" w:w="1911"/>
             <w:vAlign w:val="center"/>
             <w:tcMar>
               <w:top w:w="90" w:type="dxa"/>
@@ -5823,7 +5472,6 @@
               <w:bottom w:w="90" w:type="dxa"/>
               <w:end w:w="100" w:type="dxa"/>
             </w:tcMar>
-            <w:shd w:fill="EAF2F8"/>
           </w:tcPr>
           <w:p>
             <w:pPr>
@@ -5841,7 +5489,7 @@
         </w:tc>
         <w:tc>
           <w:tcPr>
-            <w:tcW w:type="dxa" w:w="3681"/>
+            <w:tcW w:type="dxa" w:w="3069"/>
             <w:vAlign w:val="center"/>
             <w:tcMar>
               <w:top w:w="90" w:type="dxa"/>
@@ -5849,7 +5497,6 @@
               <w:bottom w:w="90" w:type="dxa"/>
               <w:end w:w="100" w:type="dxa"/>
             </w:tcMar>
-            <w:shd w:fill="EAF2F8"/>
           </w:tcPr>
           <w:p>
             <w:pPr>
@@ -5867,7 +5514,7 @@
         </w:tc>
         <w:tc>
           <w:tcPr>
-            <w:tcW w:type="dxa" w:w="3820"/>
+            <w:tcW w:type="dxa" w:w="3185"/>
             <w:vAlign w:val="center"/>
             <w:tcMar>
               <w:top w:w="90" w:type="dxa"/>
@@ -5875,7 +5522,6 @@
               <w:bottom w:w="90" w:type="dxa"/>
               <w:end w:w="100" w:type="dxa"/>
             </w:tcMar>
-            <w:shd w:fill="EAF2F8"/>
           </w:tcPr>
           <w:p>
             <w:pPr>
@@ -5898,7 +5544,7 @@
         </w:trPr>
         <w:tc>
           <w:tcPr>
-            <w:tcW w:type="dxa" w:w="2292"/>
+            <w:tcW w:type="dxa" w:w="1911"/>
             <w:vAlign w:val="center"/>
             <w:tcMar>
               <w:top w:w="90" w:type="dxa"/>
@@ -5923,7 +5569,7 @@
         </w:tc>
         <w:tc>
           <w:tcPr>
-            <w:tcW w:type="dxa" w:w="3681"/>
+            <w:tcW w:type="dxa" w:w="3069"/>
             <w:vAlign w:val="center"/>
             <w:tcMar>
               <w:top w:w="90" w:type="dxa"/>
@@ -5948,7 +5594,7 @@
         </w:tc>
         <w:tc>
           <w:tcPr>
-            <w:tcW w:type="dxa" w:w="3820"/>
+            <w:tcW w:type="dxa" w:w="3185"/>
             <w:vAlign w:val="center"/>
             <w:tcMar>
               <w:top w:w="90" w:type="dxa"/>
@@ -5978,7 +5624,7 @@
         </w:trPr>
         <w:tc>
           <w:tcPr>
-            <w:tcW w:type="dxa" w:w="2292"/>
+            <w:tcW w:type="dxa" w:w="1911"/>
             <w:vAlign w:val="center"/>
             <w:tcMar>
               <w:top w:w="90" w:type="dxa"/>
@@ -5986,7 +5632,6 @@
               <w:bottom w:w="90" w:type="dxa"/>
               <w:end w:w="100" w:type="dxa"/>
             </w:tcMar>
-            <w:shd w:fill="EAF2F8"/>
           </w:tcPr>
           <w:p>
             <w:pPr>
@@ -6004,7 +5649,7 @@
         </w:tc>
         <w:tc>
           <w:tcPr>
-            <w:tcW w:type="dxa" w:w="3681"/>
+            <w:tcW w:type="dxa" w:w="3069"/>
             <w:vAlign w:val="center"/>
             <w:tcMar>
               <w:top w:w="90" w:type="dxa"/>
@@ -6012,7 +5657,6 @@
               <w:bottom w:w="90" w:type="dxa"/>
               <w:end w:w="100" w:type="dxa"/>
             </w:tcMar>
-            <w:shd w:fill="EAF2F8"/>
           </w:tcPr>
           <w:p>
             <w:pPr>
@@ -6030,7 +5674,7 @@
         </w:tc>
         <w:tc>
           <w:tcPr>
-            <w:tcW w:type="dxa" w:w="3820"/>
+            <w:tcW w:type="dxa" w:w="3185"/>
             <w:vAlign w:val="center"/>
             <w:tcMar>
               <w:top w:w="90" w:type="dxa"/>
@@ -6038,7 +5682,6 @@
               <w:bottom w:w="90" w:type="dxa"/>
               <w:end w:w="100" w:type="dxa"/>
             </w:tcMar>
-            <w:shd w:fill="EAF2F8"/>
           </w:tcPr>
           <w:p>
             <w:pPr>
@@ -6061,7 +5704,7 @@
         </w:trPr>
         <w:tc>
           <w:tcPr>
-            <w:tcW w:type="dxa" w:w="2292"/>
+            <w:tcW w:type="dxa" w:w="1911"/>
             <w:vAlign w:val="center"/>
             <w:tcMar>
               <w:top w:w="90" w:type="dxa"/>
@@ -6086,7 +5729,7 @@
         </w:tc>
         <w:tc>
           <w:tcPr>
-            <w:tcW w:type="dxa" w:w="3681"/>
+            <w:tcW w:type="dxa" w:w="3069"/>
             <w:vAlign w:val="center"/>
             <w:tcMar>
               <w:top w:w="90" w:type="dxa"/>
@@ -6111,7 +5754,7 @@
         </w:tc>
         <w:tc>
           <w:tcPr>
-            <w:tcW w:type="dxa" w:w="3820"/>
+            <w:tcW w:type="dxa" w:w="3185"/>
             <w:vAlign w:val="center"/>
             <w:tcMar>
               <w:top w:w="90" w:type="dxa"/>
@@ -6141,7 +5784,7 @@
         </w:trPr>
         <w:tc>
           <w:tcPr>
-            <w:tcW w:type="dxa" w:w="2292"/>
+            <w:tcW w:type="dxa" w:w="1911"/>
             <w:vAlign w:val="center"/>
             <w:tcMar>
               <w:top w:w="90" w:type="dxa"/>
@@ -6149,7 +5792,6 @@
               <w:bottom w:w="90" w:type="dxa"/>
               <w:end w:w="100" w:type="dxa"/>
             </w:tcMar>
-            <w:shd w:fill="EAF2F8"/>
           </w:tcPr>
           <w:p>
             <w:pPr>
@@ -6167,7 +5809,7 @@
         </w:tc>
         <w:tc>
           <w:tcPr>
-            <w:tcW w:type="dxa" w:w="3681"/>
+            <w:tcW w:type="dxa" w:w="3069"/>
             <w:vAlign w:val="center"/>
             <w:tcMar>
               <w:top w:w="90" w:type="dxa"/>
@@ -6175,7 +5817,6 @@
               <w:bottom w:w="90" w:type="dxa"/>
               <w:end w:w="100" w:type="dxa"/>
             </w:tcMar>
-            <w:shd w:fill="EAF2F8"/>
           </w:tcPr>
           <w:p>
             <w:pPr>
@@ -6193,7 +5834,7 @@
         </w:tc>
         <w:tc>
           <w:tcPr>
-            <w:tcW w:type="dxa" w:w="3820"/>
+            <w:tcW w:type="dxa" w:w="3185"/>
             <w:vAlign w:val="center"/>
             <w:tcMar>
               <w:top w:w="90" w:type="dxa"/>
@@ -6201,7 +5842,6 @@
               <w:bottom w:w="90" w:type="dxa"/>
               <w:end w:w="100" w:type="dxa"/>
             </w:tcMar>
-            <w:shd w:fill="EAF2F8"/>
           </w:tcPr>
           <w:p>
             <w:pPr>
@@ -6224,7 +5864,7 @@
         </w:trPr>
         <w:tc>
           <w:tcPr>
-            <w:tcW w:type="dxa" w:w="2292"/>
+            <w:tcW w:type="dxa" w:w="1911"/>
             <w:vAlign w:val="center"/>
             <w:tcMar>
               <w:top w:w="90" w:type="dxa"/>
@@ -6249,7 +5889,7 @@
         </w:tc>
         <w:tc>
           <w:tcPr>
-            <w:tcW w:type="dxa" w:w="3681"/>
+            <w:tcW w:type="dxa" w:w="3069"/>
             <w:vAlign w:val="center"/>
             <w:tcMar>
               <w:top w:w="90" w:type="dxa"/>
@@ -6274,7 +5914,7 @@
         </w:tc>
         <w:tc>
           <w:tcPr>
-            <w:tcW w:type="dxa" w:w="3820"/>
+            <w:tcW w:type="dxa" w:w="3185"/>
             <w:vAlign w:val="center"/>
             <w:tcMar>
               <w:top w:w="90" w:type="dxa"/>
@@ -6647,9 +6287,9 @@
         <w:tblLook w:firstColumn="1" w:firstRow="1" w:lastColumn="0" w:lastRow="0" w:noHBand="0" w:noVBand="1" w:val="04A0"/>
       </w:tblPr>
       <w:tblGrid>
-        <w:gridCol w:w="3264"/>
-        <w:gridCol w:w="3264"/>
-        <w:gridCol w:w="3264"/>
+        <w:gridCol w:w="2722"/>
+        <w:gridCol w:w="2722"/>
+        <w:gridCol w:w="2722"/>
       </w:tblGrid>
       <w:tr>
         <w:trPr>
@@ -6658,8 +6298,7 @@
         </w:trPr>
         <w:tc>
           <w:tcPr>
-            <w:tcW w:type="dxa" w:w="1724"/>
-            <w:shd w:fill="1F4E78"/>
+            <w:tcW w:type="dxa" w:w="1437"/>
             <w:vAlign w:val="center"/>
             <w:tcMar>
               <w:top w:w="90" w:type="dxa"/>
@@ -6676,7 +6315,7 @@
               <w:rPr>
                 <w:rFonts w:ascii="Times New Roman" w:hAnsi="Times New Roman"/>
                 <w:b/>
-                <w:color w:val="FFFFFF"/>
+                <w:color w:val="000000"/>
                 <w:sz w:val="20"/>
               </w:rPr>
               <w:t>Page</w:t>
@@ -6685,8 +6324,7 @@
         </w:tc>
         <w:tc>
           <w:tcPr>
-            <w:tcW w:type="dxa" w:w="5034"/>
-            <w:shd w:fill="1F4E78"/>
+            <w:tcW w:type="dxa" w:w="4197"/>
             <w:vAlign w:val="center"/>
             <w:tcMar>
               <w:top w:w="90" w:type="dxa"/>
@@ -6703,7 +6341,7 @@
               <w:rPr>
                 <w:rFonts w:ascii="Times New Roman" w:hAnsi="Times New Roman"/>
                 <w:b/>
-                <w:color w:val="FFFFFF"/>
+                <w:color w:val="000000"/>
                 <w:sz w:val="20"/>
               </w:rPr>
               <w:t>Main purpose</w:t>
@@ -6712,8 +6350,7 @@
         </w:tc>
         <w:tc>
           <w:tcPr>
-            <w:tcW w:type="dxa" w:w="3034"/>
-            <w:shd w:fill="1F4E78"/>
+            <w:tcW w:type="dxa" w:w="2530"/>
             <w:vAlign w:val="center"/>
             <w:tcMar>
               <w:top w:w="90" w:type="dxa"/>
@@ -6730,7 +6367,7 @@
               <w:rPr>
                 <w:rFonts w:ascii="Times New Roman" w:hAnsi="Times New Roman"/>
                 <w:b/>
-                <w:color w:val="FFFFFF"/>
+                <w:color w:val="000000"/>
                 <w:sz w:val="20"/>
               </w:rPr>
               <w:t>Typical access</w:t>
@@ -6744,7 +6381,7 @@
         </w:trPr>
         <w:tc>
           <w:tcPr>
-            <w:tcW w:type="dxa" w:w="1724"/>
+            <w:tcW w:type="dxa" w:w="1437"/>
             <w:vAlign w:val="center"/>
             <w:tcMar>
               <w:top w:w="90" w:type="dxa"/>
@@ -6769,7 +6406,7 @@
         </w:tc>
         <w:tc>
           <w:tcPr>
-            <w:tcW w:type="dxa" w:w="5034"/>
+            <w:tcW w:type="dxa" w:w="4197"/>
             <w:vAlign w:val="center"/>
             <w:tcMar>
               <w:top w:w="90" w:type="dxa"/>
@@ -6794,7 +6431,7 @@
         </w:tc>
         <w:tc>
           <w:tcPr>
-            <w:tcW w:type="dxa" w:w="3034"/>
+            <w:tcW w:type="dxa" w:w="2530"/>
             <w:vAlign w:val="center"/>
             <w:tcMar>
               <w:top w:w="90" w:type="dxa"/>
@@ -6824,90 +6461,7 @@
         </w:trPr>
         <w:tc>
           <w:tcPr>
-            <w:tcW w:type="dxa" w:w="1724"/>
-            <w:vAlign w:val="center"/>
-            <w:tcMar>
-              <w:top w:w="90" w:type="dxa"/>
-              <w:start w:w="100" w:type="dxa"/>
-              <w:bottom w:w="90" w:type="dxa"/>
-              <w:end w:w="100" w:type="dxa"/>
-            </w:tcMar>
-            <w:shd w:fill="EAF2F8"/>
-          </w:tcPr>
-          <w:p>
-            <w:pPr>
-              <w:jc w:val="left"/>
-            </w:pPr>
-            <w:r>
-              <w:rPr>
-                <w:rFonts w:ascii="Times New Roman" w:hAnsi="Times New Roman"/>
-                <w:color w:val="000000"/>
-                <w:sz w:val="20"/>
-              </w:rPr>
-              <w:t>Home</w:t>
-            </w:r>
-          </w:p>
-        </w:tc>
-        <w:tc>
-          <w:tcPr>
-            <w:tcW w:type="dxa" w:w="5034"/>
-            <w:vAlign w:val="center"/>
-            <w:tcMar>
-              <w:top w:w="90" w:type="dxa"/>
-              <w:start w:w="100" w:type="dxa"/>
-              <w:bottom w:w="90" w:type="dxa"/>
-              <w:end w:w="100" w:type="dxa"/>
-            </w:tcMar>
-            <w:shd w:fill="EAF2F8"/>
-          </w:tcPr>
-          <w:p>
-            <w:pPr>
-              <w:jc w:val="left"/>
-            </w:pPr>
-            <w:r>
-              <w:rPr>
-                <w:rFonts w:ascii="Times New Roman" w:hAnsi="Times New Roman"/>
-                <w:color w:val="000000"/>
-                <w:sz w:val="20"/>
-              </w:rPr>
-              <w:t>Show scan options, totals, shortcuts, and role tools</w:t>
-            </w:r>
-          </w:p>
-        </w:tc>
-        <w:tc>
-          <w:tcPr>
-            <w:tcW w:type="dxa" w:w="3034"/>
-            <w:vAlign w:val="center"/>
-            <w:tcMar>
-              <w:top w:w="90" w:type="dxa"/>
-              <w:start w:w="100" w:type="dxa"/>
-              <w:bottom w:w="90" w:type="dxa"/>
-              <w:end w:w="100" w:type="dxa"/>
-            </w:tcMar>
-            <w:shd w:fill="EAF2F8"/>
-          </w:tcPr>
-          <w:p>
-            <w:pPr>
-              <w:jc w:val="left"/>
-            </w:pPr>
-            <w:r>
-              <w:rPr>
-                <w:rFonts w:ascii="Times New Roman" w:hAnsi="Times New Roman"/>
-                <w:color w:val="000000"/>
-                <w:sz w:val="20"/>
-              </w:rPr>
-              <w:t>All signed in users</w:t>
-            </w:r>
-          </w:p>
-        </w:tc>
-      </w:tr>
-      <w:tr>
-        <w:trPr>
-          <w:cantSplit/>
-        </w:trPr>
-        <w:tc>
-          <w:tcPr>
-            <w:tcW w:type="dxa" w:w="1724"/>
+            <w:tcW w:type="dxa" w:w="1437"/>
             <w:vAlign w:val="center"/>
             <w:tcMar>
               <w:top w:w="90" w:type="dxa"/>
@@ -6926,13 +6480,13 @@
                 <w:color w:val="000000"/>
                 <w:sz w:val="20"/>
               </w:rPr>
-              <w:t>Scanner</w:t>
+              <w:t>Home</w:t>
             </w:r>
           </w:p>
         </w:tc>
         <w:tc>
           <w:tcPr>
-            <w:tcW w:type="dxa" w:w="5034"/>
+            <w:tcW w:type="dxa" w:w="4197"/>
             <w:vAlign w:val="center"/>
             <w:tcMar>
               <w:top w:w="90" w:type="dxa"/>
@@ -6951,13 +6505,13 @@
                 <w:color w:val="000000"/>
                 <w:sz w:val="20"/>
               </w:rPr>
-              <w:t>Capture QR content through the camera</w:t>
+              <w:t>Show scan options, totals, shortcuts, and role tools</w:t>
             </w:r>
           </w:p>
         </w:tc>
         <w:tc>
           <w:tcPr>
-            <w:tcW w:type="dxa" w:w="3034"/>
+            <w:tcW w:type="dxa" w:w="2530"/>
             <w:vAlign w:val="center"/>
             <w:tcMar>
               <w:top w:w="90" w:type="dxa"/>
@@ -6987,7 +6541,7 @@
         </w:trPr>
         <w:tc>
           <w:tcPr>
-            <w:tcW w:type="dxa" w:w="1724"/>
+            <w:tcW w:type="dxa" w:w="1437"/>
             <w:vAlign w:val="center"/>
             <w:tcMar>
               <w:top w:w="90" w:type="dxa"/>
@@ -6995,7 +6549,6 @@
               <w:bottom w:w="90" w:type="dxa"/>
               <w:end w:w="100" w:type="dxa"/>
             </w:tcMar>
-            <w:shd w:fill="EAF2F8"/>
           </w:tcPr>
           <w:p>
             <w:pPr>
@@ -7007,13 +6560,13 @@
                 <w:color w:val="000000"/>
                 <w:sz w:val="20"/>
               </w:rPr>
-              <w:t>Manual Scan</w:t>
+              <w:t>Scanner</w:t>
             </w:r>
           </w:p>
         </w:tc>
         <w:tc>
           <w:tcPr>
-            <w:tcW w:type="dxa" w:w="5034"/>
+            <w:tcW w:type="dxa" w:w="4197"/>
             <w:vAlign w:val="center"/>
             <w:tcMar>
               <w:top w:w="90" w:type="dxa"/>
@@ -7021,7 +6574,6 @@
               <w:bottom w:w="90" w:type="dxa"/>
               <w:end w:w="100" w:type="dxa"/>
             </w:tcMar>
-            <w:shd w:fill="EAF2F8"/>
           </w:tcPr>
           <w:p>
             <w:pPr>
@@ -7033,13 +6585,13 @@
                 <w:color w:val="000000"/>
                 <w:sz w:val="20"/>
               </w:rPr>
-              <w:t>Check a typed web address</w:t>
+              <w:t>Capture QR content through the camera</w:t>
             </w:r>
           </w:p>
         </w:tc>
         <w:tc>
           <w:tcPr>
-            <w:tcW w:type="dxa" w:w="3034"/>
+            <w:tcW w:type="dxa" w:w="2530"/>
             <w:vAlign w:val="center"/>
             <w:tcMar>
               <w:top w:w="90" w:type="dxa"/>
@@ -7047,7 +6599,6 @@
               <w:bottom w:w="90" w:type="dxa"/>
               <w:end w:w="100" w:type="dxa"/>
             </w:tcMar>
-            <w:shd w:fill="EAF2F8"/>
           </w:tcPr>
           <w:p>
             <w:pPr>
@@ -7070,7 +6621,87 @@
         </w:trPr>
         <w:tc>
           <w:tcPr>
-            <w:tcW w:type="dxa" w:w="1724"/>
+            <w:tcW w:type="dxa" w:w="1437"/>
+            <w:vAlign w:val="center"/>
+            <w:tcMar>
+              <w:top w:w="90" w:type="dxa"/>
+              <w:start w:w="100" w:type="dxa"/>
+              <w:bottom w:w="90" w:type="dxa"/>
+              <w:end w:w="100" w:type="dxa"/>
+            </w:tcMar>
+          </w:tcPr>
+          <w:p>
+            <w:pPr>
+              <w:jc w:val="left"/>
+            </w:pPr>
+            <w:r>
+              <w:rPr>
+                <w:rFonts w:ascii="Times New Roman" w:hAnsi="Times New Roman"/>
+                <w:color w:val="000000"/>
+                <w:sz w:val="20"/>
+              </w:rPr>
+              <w:t>Manual Scan</w:t>
+            </w:r>
+          </w:p>
+        </w:tc>
+        <w:tc>
+          <w:tcPr>
+            <w:tcW w:type="dxa" w:w="4197"/>
+            <w:vAlign w:val="center"/>
+            <w:tcMar>
+              <w:top w:w="90" w:type="dxa"/>
+              <w:start w:w="100" w:type="dxa"/>
+              <w:bottom w:w="90" w:type="dxa"/>
+              <w:end w:w="100" w:type="dxa"/>
+            </w:tcMar>
+          </w:tcPr>
+          <w:p>
+            <w:pPr>
+              <w:jc w:val="left"/>
+            </w:pPr>
+            <w:r>
+              <w:rPr>
+                <w:rFonts w:ascii="Times New Roman" w:hAnsi="Times New Roman"/>
+                <w:color w:val="000000"/>
+                <w:sz w:val="20"/>
+              </w:rPr>
+              <w:t>Check a typed web address</w:t>
+            </w:r>
+          </w:p>
+        </w:tc>
+        <w:tc>
+          <w:tcPr>
+            <w:tcW w:type="dxa" w:w="2530"/>
+            <w:vAlign w:val="center"/>
+            <w:tcMar>
+              <w:top w:w="90" w:type="dxa"/>
+              <w:start w:w="100" w:type="dxa"/>
+              <w:bottom w:w="90" w:type="dxa"/>
+              <w:end w:w="100" w:type="dxa"/>
+            </w:tcMar>
+          </w:tcPr>
+          <w:p>
+            <w:pPr>
+              <w:jc w:val="left"/>
+            </w:pPr>
+            <w:r>
+              <w:rPr>
+                <w:rFonts w:ascii="Times New Roman" w:hAnsi="Times New Roman"/>
+                <w:color w:val="000000"/>
+                <w:sz w:val="20"/>
+              </w:rPr>
+              <w:t>All signed in users</w:t>
+            </w:r>
+          </w:p>
+        </w:tc>
+      </w:tr>
+      <w:tr>
+        <w:trPr>
+          <w:cantSplit/>
+        </w:trPr>
+        <w:tc>
+          <w:tcPr>
+            <w:tcW w:type="dxa" w:w="1437"/>
             <w:vAlign w:val="center"/>
             <w:tcMar>
               <w:top w:w="90" w:type="dxa"/>
@@ -7095,7 +6726,7 @@
         </w:tc>
         <w:tc>
           <w:tcPr>
-            <w:tcW w:type="dxa" w:w="5034"/>
+            <w:tcW w:type="dxa" w:w="4197"/>
             <w:vAlign w:val="center"/>
             <w:tcMar>
               <w:top w:w="90" w:type="dxa"/>
@@ -7120,7 +6751,7 @@
         </w:tc>
         <w:tc>
           <w:tcPr>
-            <w:tcW w:type="dxa" w:w="3034"/>
+            <w:tcW w:type="dxa" w:w="2530"/>
             <w:vAlign w:val="center"/>
             <w:tcMar>
               <w:top w:w="90" w:type="dxa"/>
@@ -7150,90 +6781,7 @@
         </w:trPr>
         <w:tc>
           <w:tcPr>
-            <w:tcW w:type="dxa" w:w="1724"/>
-            <w:vAlign w:val="center"/>
-            <w:tcMar>
-              <w:top w:w="90" w:type="dxa"/>
-              <w:start w:w="100" w:type="dxa"/>
-              <w:bottom w:w="90" w:type="dxa"/>
-              <w:end w:w="100" w:type="dxa"/>
-            </w:tcMar>
-            <w:shd w:fill="EAF2F8"/>
-          </w:tcPr>
-          <w:p>
-            <w:pPr>
-              <w:jc w:val="left"/>
-            </w:pPr>
-            <w:r>
-              <w:rPr>
-                <w:rFonts w:ascii="Times New Roman" w:hAnsi="Times New Roman"/>
-                <w:color w:val="000000"/>
-                <w:sz w:val="20"/>
-              </w:rPr>
-              <w:t>Dashboard</w:t>
-            </w:r>
-          </w:p>
-        </w:tc>
-        <w:tc>
-          <w:tcPr>
-            <w:tcW w:type="dxa" w:w="5034"/>
-            <w:vAlign w:val="center"/>
-            <w:tcMar>
-              <w:top w:w="90" w:type="dxa"/>
-              <w:start w:w="100" w:type="dxa"/>
-              <w:bottom w:w="90" w:type="dxa"/>
-              <w:end w:w="100" w:type="dxa"/>
-            </w:tcMar>
-            <w:shd w:fill="EAF2F8"/>
-          </w:tcPr>
-          <w:p>
-            <w:pPr>
-              <w:jc w:val="left"/>
-            </w:pPr>
-            <w:r>
-              <w:rPr>
-                <w:rFonts w:ascii="Times New Roman" w:hAnsi="Times New Roman"/>
-                <w:color w:val="000000"/>
-                <w:sz w:val="20"/>
-              </w:rPr>
-              <w:t>Summarize personal scan activity</w:t>
-            </w:r>
-          </w:p>
-        </w:tc>
-        <w:tc>
-          <w:tcPr>
-            <w:tcW w:type="dxa" w:w="3034"/>
-            <w:vAlign w:val="center"/>
-            <w:tcMar>
-              <w:top w:w="90" w:type="dxa"/>
-              <w:start w:w="100" w:type="dxa"/>
-              <w:bottom w:w="90" w:type="dxa"/>
-              <w:end w:w="100" w:type="dxa"/>
-            </w:tcMar>
-            <w:shd w:fill="EAF2F8"/>
-          </w:tcPr>
-          <w:p>
-            <w:pPr>
-              <w:jc w:val="left"/>
-            </w:pPr>
-            <w:r>
-              <w:rPr>
-                <w:rFonts w:ascii="Times New Roman" w:hAnsi="Times New Roman"/>
-                <w:color w:val="000000"/>
-                <w:sz w:val="20"/>
-              </w:rPr>
-              <w:t>All signed in users</w:t>
-            </w:r>
-          </w:p>
-        </w:tc>
-      </w:tr>
-      <w:tr>
-        <w:trPr>
-          <w:cantSplit/>
-        </w:trPr>
-        <w:tc>
-          <w:tcPr>
-            <w:tcW w:type="dxa" w:w="1724"/>
+            <w:tcW w:type="dxa" w:w="1437"/>
             <w:vAlign w:val="center"/>
             <w:tcMar>
               <w:top w:w="90" w:type="dxa"/>
@@ -7252,13 +6800,13 @@
                 <w:color w:val="000000"/>
                 <w:sz w:val="20"/>
               </w:rPr>
-              <w:t>History</w:t>
+              <w:t>Dashboard</w:t>
             </w:r>
           </w:p>
         </w:tc>
         <w:tc>
           <w:tcPr>
-            <w:tcW w:type="dxa" w:w="5034"/>
+            <w:tcW w:type="dxa" w:w="4197"/>
             <w:vAlign w:val="center"/>
             <w:tcMar>
               <w:top w:w="90" w:type="dxa"/>
@@ -7277,13 +6825,13 @@
                 <w:color w:val="000000"/>
                 <w:sz w:val="20"/>
               </w:rPr>
-              <w:t>Search and review previous scans</w:t>
+              <w:t>Summarize personal scan activity</w:t>
             </w:r>
           </w:p>
         </w:tc>
         <w:tc>
           <w:tcPr>
-            <w:tcW w:type="dxa" w:w="3034"/>
+            <w:tcW w:type="dxa" w:w="2530"/>
             <w:vAlign w:val="center"/>
             <w:tcMar>
               <w:top w:w="90" w:type="dxa"/>
@@ -7313,7 +6861,7 @@
         </w:trPr>
         <w:tc>
           <w:tcPr>
-            <w:tcW w:type="dxa" w:w="1724"/>
+            <w:tcW w:type="dxa" w:w="1437"/>
             <w:vAlign w:val="center"/>
             <w:tcMar>
               <w:top w:w="90" w:type="dxa"/>
@@ -7321,7 +6869,86 @@
               <w:bottom w:w="90" w:type="dxa"/>
               <w:end w:w="100" w:type="dxa"/>
             </w:tcMar>
-            <w:shd w:fill="EAF2F8"/>
+          </w:tcPr>
+          <w:p>
+            <w:pPr>
+              <w:jc w:val="left"/>
+            </w:pPr>
+            <w:r>
+              <w:rPr>
+                <w:rFonts w:ascii="Times New Roman" w:hAnsi="Times New Roman"/>
+                <w:color w:val="000000"/>
+                <w:sz w:val="20"/>
+              </w:rPr>
+              <w:t>History</w:t>
+            </w:r>
+          </w:p>
+        </w:tc>
+        <w:tc>
+          <w:tcPr>
+            <w:tcW w:type="dxa" w:w="4197"/>
+            <w:vAlign w:val="center"/>
+            <w:tcMar>
+              <w:top w:w="90" w:type="dxa"/>
+              <w:start w:w="100" w:type="dxa"/>
+              <w:bottom w:w="90" w:type="dxa"/>
+              <w:end w:w="100" w:type="dxa"/>
+            </w:tcMar>
+          </w:tcPr>
+          <w:p>
+            <w:pPr>
+              <w:jc w:val="left"/>
+            </w:pPr>
+            <w:r>
+              <w:rPr>
+                <w:rFonts w:ascii="Times New Roman" w:hAnsi="Times New Roman"/>
+                <w:color w:val="000000"/>
+                <w:sz w:val="20"/>
+              </w:rPr>
+              <w:t>Search and review previous scans</w:t>
+            </w:r>
+          </w:p>
+        </w:tc>
+        <w:tc>
+          <w:tcPr>
+            <w:tcW w:type="dxa" w:w="2530"/>
+            <w:vAlign w:val="center"/>
+            <w:tcMar>
+              <w:top w:w="90" w:type="dxa"/>
+              <w:start w:w="100" w:type="dxa"/>
+              <w:bottom w:w="90" w:type="dxa"/>
+              <w:end w:w="100" w:type="dxa"/>
+            </w:tcMar>
+          </w:tcPr>
+          <w:p>
+            <w:pPr>
+              <w:jc w:val="left"/>
+            </w:pPr>
+            <w:r>
+              <w:rPr>
+                <w:rFonts w:ascii="Times New Roman" w:hAnsi="Times New Roman"/>
+                <w:color w:val="000000"/>
+                <w:sz w:val="20"/>
+              </w:rPr>
+              <w:t>All signed in users</w:t>
+            </w:r>
+          </w:p>
+        </w:tc>
+      </w:tr>
+      <w:tr>
+        <w:trPr>
+          <w:cantSplit/>
+        </w:trPr>
+        <w:tc>
+          <w:tcPr>
+            <w:tcW w:type="dxa" w:w="1437"/>
+            <w:vAlign w:val="center"/>
+            <w:tcMar>
+              <w:top w:w="90" w:type="dxa"/>
+              <w:start w:w="100" w:type="dxa"/>
+              <w:bottom w:w="90" w:type="dxa"/>
+              <w:end w:w="100" w:type="dxa"/>
+            </w:tcMar>
           </w:tcPr>
           <w:p>
             <w:pPr>
@@ -7339,7 +6966,7 @@
         </w:tc>
         <w:tc>
           <w:tcPr>
-            <w:tcW w:type="dxa" w:w="5034"/>
+            <w:tcW w:type="dxa" w:w="4197"/>
             <w:vAlign w:val="center"/>
             <w:tcMar>
               <w:top w:w="90" w:type="dxa"/>
@@ -7347,7 +6974,6 @@
               <w:bottom w:w="90" w:type="dxa"/>
               <w:end w:w="100" w:type="dxa"/>
             </w:tcMar>
-            <w:shd w:fill="EAF2F8"/>
           </w:tcPr>
           <w:p>
             <w:pPr>
@@ -7365,7 +6991,7 @@
         </w:tc>
         <w:tc>
           <w:tcPr>
-            <w:tcW w:type="dxa" w:w="3034"/>
+            <w:tcW w:type="dxa" w:w="2530"/>
             <w:vAlign w:val="center"/>
             <w:tcMar>
               <w:top w:w="90" w:type="dxa"/>
@@ -7373,7 +6999,6 @@
               <w:bottom w:w="90" w:type="dxa"/>
               <w:end w:w="100" w:type="dxa"/>
             </w:tcMar>
-            <w:shd w:fill="EAF2F8"/>
           </w:tcPr>
           <w:p>
             <w:pPr>
@@ -7396,7 +7021,7 @@
         </w:trPr>
         <w:tc>
           <w:tcPr>
-            <w:tcW w:type="dxa" w:w="1724"/>
+            <w:tcW w:type="dxa" w:w="1437"/>
             <w:vAlign w:val="center"/>
             <w:tcMar>
               <w:top w:w="90" w:type="dxa"/>
@@ -7421,7 +7046,7 @@
         </w:tc>
         <w:tc>
           <w:tcPr>
-            <w:tcW w:type="dxa" w:w="5034"/>
+            <w:tcW w:type="dxa" w:w="4197"/>
             <w:vAlign w:val="center"/>
             <w:tcMar>
               <w:top w:w="90" w:type="dxa"/>
@@ -7446,7 +7071,7 @@
         </w:tc>
         <w:tc>
           <w:tcPr>
-            <w:tcW w:type="dxa" w:w="3034"/>
+            <w:tcW w:type="dxa" w:w="2530"/>
             <w:vAlign w:val="center"/>
             <w:tcMar>
               <w:top w:w="90" w:type="dxa"/>
@@ -7476,7 +7101,7 @@
         </w:trPr>
         <w:tc>
           <w:tcPr>
-            <w:tcW w:type="dxa" w:w="1724"/>
+            <w:tcW w:type="dxa" w:w="1437"/>
             <w:vAlign w:val="center"/>
             <w:tcMar>
               <w:top w:w="90" w:type="dxa"/>
@@ -7484,7 +7109,6 @@
               <w:bottom w:w="90" w:type="dxa"/>
               <w:end w:w="100" w:type="dxa"/>
             </w:tcMar>
-            <w:shd w:fill="EAF2F8"/>
           </w:tcPr>
           <w:p>
             <w:pPr>
@@ -7502,7 +7126,7 @@
         </w:tc>
         <w:tc>
           <w:tcPr>
-            <w:tcW w:type="dxa" w:w="5034"/>
+            <w:tcW w:type="dxa" w:w="4197"/>
             <w:vAlign w:val="center"/>
             <w:tcMar>
               <w:top w:w="90" w:type="dxa"/>
@@ -7510,7 +7134,6 @@
               <w:bottom w:w="90" w:type="dxa"/>
               <w:end w:w="100" w:type="dxa"/>
             </w:tcMar>
-            <w:shd w:fill="EAF2F8"/>
           </w:tcPr>
           <w:p>
             <w:pPr>
@@ -7528,7 +7151,7 @@
         </w:tc>
         <w:tc>
           <w:tcPr>
-            <w:tcW w:type="dxa" w:w="3034"/>
+            <w:tcW w:type="dxa" w:w="2530"/>
             <w:vAlign w:val="center"/>
             <w:tcMar>
               <w:top w:w="90" w:type="dxa"/>
@@ -7536,7 +7159,6 @@
               <w:bottom w:w="90" w:type="dxa"/>
               <w:end w:w="100" w:type="dxa"/>
             </w:tcMar>
-            <w:shd w:fill="EAF2F8"/>
           </w:tcPr>
           <w:p>
             <w:pPr>
@@ -7559,7 +7181,7 @@
         </w:trPr>
         <w:tc>
           <w:tcPr>
-            <w:tcW w:type="dxa" w:w="1724"/>
+            <w:tcW w:type="dxa" w:w="1437"/>
             <w:vAlign w:val="center"/>
             <w:tcMar>
               <w:top w:w="90" w:type="dxa"/>
@@ -7584,7 +7206,7 @@
         </w:tc>
         <w:tc>
           <w:tcPr>
-            <w:tcW w:type="dxa" w:w="5034"/>
+            <w:tcW w:type="dxa" w:w="4197"/>
             <w:vAlign w:val="center"/>
             <w:tcMar>
               <w:top w:w="90" w:type="dxa"/>
@@ -7609,7 +7231,7 @@
         </w:tc>
         <w:tc>
           <w:tcPr>
-            <w:tcW w:type="dxa" w:w="3034"/>
+            <w:tcW w:type="dxa" w:w="2530"/>
             <w:vAlign w:val="center"/>
             <w:tcMar>
               <w:top w:w="90" w:type="dxa"/>
@@ -7639,7 +7261,7 @@
         </w:trPr>
         <w:tc>
           <w:tcPr>
-            <w:tcW w:type="dxa" w:w="1724"/>
+            <w:tcW w:type="dxa" w:w="1437"/>
             <w:vAlign w:val="center"/>
             <w:tcMar>
               <w:top w:w="90" w:type="dxa"/>
@@ -7647,7 +7269,6 @@
               <w:bottom w:w="90" w:type="dxa"/>
               <w:end w:w="100" w:type="dxa"/>
             </w:tcMar>
-            <w:shd w:fill="EAF2F8"/>
           </w:tcPr>
           <w:p>
             <w:pPr>
@@ -7665,7 +7286,7 @@
         </w:tc>
         <w:tc>
           <w:tcPr>
-            <w:tcW w:type="dxa" w:w="5034"/>
+            <w:tcW w:type="dxa" w:w="4197"/>
             <w:vAlign w:val="center"/>
             <w:tcMar>
               <w:top w:w="90" w:type="dxa"/>
@@ -7673,7 +7294,6 @@
               <w:bottom w:w="90" w:type="dxa"/>
               <w:end w:w="100" w:type="dxa"/>
             </w:tcMar>
-            <w:shd w:fill="EAF2F8"/>
           </w:tcPr>
           <w:p>
             <w:pPr>
@@ -7691,7 +7311,7 @@
         </w:tc>
         <w:tc>
           <w:tcPr>
-            <w:tcW w:type="dxa" w:w="3034"/>
+            <w:tcW w:type="dxa" w:w="2530"/>
             <w:vAlign w:val="center"/>
             <w:tcMar>
               <w:top w:w="90" w:type="dxa"/>
@@ -7699,7 +7319,6 @@
               <w:bottom w:w="90" w:type="dxa"/>
               <w:end w:w="100" w:type="dxa"/>
             </w:tcMar>
-            <w:shd w:fill="EAF2F8"/>
           </w:tcPr>
           <w:p>
             <w:pPr>
@@ -7739,9 +7358,9 @@
         <w:tblLook w:firstColumn="1" w:firstRow="1" w:lastColumn="0" w:lastRow="0" w:noHBand="0" w:noVBand="1" w:val="04A0"/>
       </w:tblPr>
       <w:tblGrid>
-        <w:gridCol w:w="3264"/>
-        <w:gridCol w:w="3264"/>
-        <w:gridCol w:w="3264"/>
+        <w:gridCol w:w="2722"/>
+        <w:gridCol w:w="2722"/>
+        <w:gridCol w:w="2722"/>
       </w:tblGrid>
       <w:tr>
         <w:trPr>
@@ -7750,8 +7369,7 @@
         </w:trPr>
         <w:tc>
           <w:tcPr>
-            <w:tcW w:type="dxa" w:w="1862"/>
-            <w:shd w:fill="1F4E78"/>
+            <w:tcW w:type="dxa" w:w="1552"/>
             <w:vAlign w:val="center"/>
             <w:tcMar>
               <w:top w:w="90" w:type="dxa"/>
@@ -7768,7 +7386,7 @@
               <w:rPr>
                 <w:rFonts w:ascii="Times New Roman" w:hAnsi="Times New Roman"/>
                 <w:b/>
-                <w:color w:val="FFFFFF"/>
+                <w:color w:val="000000"/>
                 <w:sz w:val="20"/>
               </w:rPr>
               <w:t>Entity</w:t>
@@ -7777,8 +7395,7 @@
         </w:tc>
         <w:tc>
           <w:tcPr>
-            <w:tcW w:type="dxa" w:w="2896"/>
-            <w:shd w:fill="1F4E78"/>
+            <w:tcW w:type="dxa" w:w="2415"/>
             <w:vAlign w:val="center"/>
             <w:tcMar>
               <w:top w:w="90" w:type="dxa"/>
@@ -7795,7 +7412,7 @@
               <w:rPr>
                 <w:rFonts w:ascii="Times New Roman" w:hAnsi="Times New Roman"/>
                 <w:b/>
-                <w:color w:val="FFFFFF"/>
+                <w:color w:val="000000"/>
                 <w:sz w:val="20"/>
               </w:rPr>
               <w:t>Purpose</w:t>
@@ -7804,8 +7421,7 @@
         </w:tc>
         <w:tc>
           <w:tcPr>
-            <w:tcW w:type="dxa" w:w="5034"/>
-            <w:shd w:fill="1F4E78"/>
+            <w:tcW w:type="dxa" w:w="4197"/>
             <w:vAlign w:val="center"/>
             <w:tcMar>
               <w:top w:w="90" w:type="dxa"/>
@@ -7822,7 +7438,7 @@
               <w:rPr>
                 <w:rFonts w:ascii="Times New Roman" w:hAnsi="Times New Roman"/>
                 <w:b/>
-                <w:color w:val="FFFFFF"/>
+                <w:color w:val="000000"/>
                 <w:sz w:val="20"/>
               </w:rPr>
               <w:t>Important information</w:t>
@@ -7836,7 +7452,7 @@
         </w:trPr>
         <w:tc>
           <w:tcPr>
-            <w:tcW w:type="dxa" w:w="1862"/>
+            <w:tcW w:type="dxa" w:w="1552"/>
             <w:vAlign w:val="center"/>
             <w:tcMar>
               <w:top w:w="90" w:type="dxa"/>
@@ -7861,7 +7477,7 @@
         </w:tc>
         <w:tc>
           <w:tcPr>
-            <w:tcW w:type="dxa" w:w="2896"/>
+            <w:tcW w:type="dxa" w:w="2415"/>
             <w:vAlign w:val="center"/>
             <w:tcMar>
               <w:top w:w="90" w:type="dxa"/>
@@ -7886,7 +7502,7 @@
         </w:tc>
         <w:tc>
           <w:tcPr>
-            <w:tcW w:type="dxa" w:w="5034"/>
+            <w:tcW w:type="dxa" w:w="4197"/>
             <w:vAlign w:val="center"/>
             <w:tcMar>
               <w:top w:w="90" w:type="dxa"/>
@@ -7916,7 +7532,7 @@
         </w:trPr>
         <w:tc>
           <w:tcPr>
-            <w:tcW w:type="dxa" w:w="1862"/>
+            <w:tcW w:type="dxa" w:w="1552"/>
             <w:vAlign w:val="center"/>
             <w:tcMar>
               <w:top w:w="90" w:type="dxa"/>
@@ -7924,7 +7540,6 @@
               <w:bottom w:w="90" w:type="dxa"/>
               <w:end w:w="100" w:type="dxa"/>
             </w:tcMar>
-            <w:shd w:fill="EAF2F8"/>
           </w:tcPr>
           <w:p>
             <w:pPr>
@@ -7942,7 +7557,7 @@
         </w:tc>
         <w:tc>
           <w:tcPr>
-            <w:tcW w:type="dxa" w:w="2896"/>
+            <w:tcW w:type="dxa" w:w="2415"/>
             <w:vAlign w:val="center"/>
             <w:tcMar>
               <w:top w:w="90" w:type="dxa"/>
@@ -7950,7 +7565,6 @@
               <w:bottom w:w="90" w:type="dxa"/>
               <w:end w:w="100" w:type="dxa"/>
             </w:tcMar>
-            <w:shd w:fill="EAF2F8"/>
           </w:tcPr>
           <w:p>
             <w:pPr>
@@ -7968,7 +7582,7 @@
         </w:tc>
         <w:tc>
           <w:tcPr>
-            <w:tcW w:type="dxa" w:w="5034"/>
+            <w:tcW w:type="dxa" w:w="4197"/>
             <w:vAlign w:val="center"/>
             <w:tcMar>
               <w:top w:w="90" w:type="dxa"/>
@@ -7976,7 +7590,6 @@
               <w:bottom w:w="90" w:type="dxa"/>
               <w:end w:w="100" w:type="dxa"/>
             </w:tcMar>
-            <w:shd w:fill="EAF2F8"/>
           </w:tcPr>
           <w:p>
             <w:pPr>
@@ -7999,7 +7612,7 @@
         </w:trPr>
         <w:tc>
           <w:tcPr>
-            <w:tcW w:type="dxa" w:w="1862"/>
+            <w:tcW w:type="dxa" w:w="1552"/>
             <w:vAlign w:val="center"/>
             <w:tcMar>
               <w:top w:w="90" w:type="dxa"/>
@@ -8024,7 +7637,7 @@
         </w:tc>
         <w:tc>
           <w:tcPr>
-            <w:tcW w:type="dxa" w:w="2896"/>
+            <w:tcW w:type="dxa" w:w="2415"/>
             <w:vAlign w:val="center"/>
             <w:tcMar>
               <w:top w:w="90" w:type="dxa"/>
@@ -8049,7 +7662,7 @@
         </w:tc>
         <w:tc>
           <w:tcPr>
-            <w:tcW w:type="dxa" w:w="5034"/>
+            <w:tcW w:type="dxa" w:w="4197"/>
             <w:vAlign w:val="center"/>
             <w:tcMar>
               <w:top w:w="90" w:type="dxa"/>
@@ -8079,7 +7692,7 @@
         </w:trPr>
         <w:tc>
           <w:tcPr>
-            <w:tcW w:type="dxa" w:w="1862"/>
+            <w:tcW w:type="dxa" w:w="1552"/>
             <w:vAlign w:val="center"/>
             <w:tcMar>
               <w:top w:w="90" w:type="dxa"/>
@@ -8087,7 +7700,6 @@
               <w:bottom w:w="90" w:type="dxa"/>
               <w:end w:w="100" w:type="dxa"/>
             </w:tcMar>
-            <w:shd w:fill="EAF2F8"/>
           </w:tcPr>
           <w:p>
             <w:pPr>
@@ -8105,7 +7717,7 @@
         </w:tc>
         <w:tc>
           <w:tcPr>
-            <w:tcW w:type="dxa" w:w="2896"/>
+            <w:tcW w:type="dxa" w:w="2415"/>
             <w:vAlign w:val="center"/>
             <w:tcMar>
               <w:top w:w="90" w:type="dxa"/>
@@ -8113,7 +7725,6 @@
               <w:bottom w:w="90" w:type="dxa"/>
               <w:end w:w="100" w:type="dxa"/>
             </w:tcMar>
-            <w:shd w:fill="EAF2F8"/>
           </w:tcPr>
           <w:p>
             <w:pPr>
@@ -8131,7 +7742,7 @@
         </w:tc>
         <w:tc>
           <w:tcPr>
-            <w:tcW w:type="dxa" w:w="5034"/>
+            <w:tcW w:type="dxa" w:w="4197"/>
             <w:vAlign w:val="center"/>
             <w:tcMar>
               <w:top w:w="90" w:type="dxa"/>
@@ -8139,7 +7750,6 @@
               <w:bottom w:w="90" w:type="dxa"/>
               <w:end w:w="100" w:type="dxa"/>
             </w:tcMar>
-            <w:shd w:fill="EAF2F8"/>
           </w:tcPr>
           <w:p>
             <w:pPr>
@@ -8162,7 +7772,7 @@
         </w:trPr>
         <w:tc>
           <w:tcPr>
-            <w:tcW w:type="dxa" w:w="1862"/>
+            <w:tcW w:type="dxa" w:w="1552"/>
             <w:vAlign w:val="center"/>
             <w:tcMar>
               <w:top w:w="90" w:type="dxa"/>
@@ -8187,7 +7797,7 @@
         </w:tc>
         <w:tc>
           <w:tcPr>
-            <w:tcW w:type="dxa" w:w="2896"/>
+            <w:tcW w:type="dxa" w:w="2415"/>
             <w:vAlign w:val="center"/>
             <w:tcMar>
               <w:top w:w="90" w:type="dxa"/>
@@ -8212,7 +7822,7 @@
         </w:tc>
         <w:tc>
           <w:tcPr>
-            <w:tcW w:type="dxa" w:w="5034"/>
+            <w:tcW w:type="dxa" w:w="4197"/>
             <w:vAlign w:val="center"/>
             <w:tcMar>
               <w:top w:w="90" w:type="dxa"/>
@@ -8242,7 +7852,7 @@
         </w:trPr>
         <w:tc>
           <w:tcPr>
-            <w:tcW w:type="dxa" w:w="1862"/>
+            <w:tcW w:type="dxa" w:w="1552"/>
             <w:vAlign w:val="center"/>
             <w:tcMar>
               <w:top w:w="90" w:type="dxa"/>
@@ -8250,7 +7860,6 @@
               <w:bottom w:w="90" w:type="dxa"/>
               <w:end w:w="100" w:type="dxa"/>
             </w:tcMar>
-            <w:shd w:fill="EAF2F8"/>
           </w:tcPr>
           <w:p>
             <w:pPr>
@@ -8268,7 +7877,7 @@
         </w:tc>
         <w:tc>
           <w:tcPr>
-            <w:tcW w:type="dxa" w:w="2896"/>
+            <w:tcW w:type="dxa" w:w="2415"/>
             <w:vAlign w:val="center"/>
             <w:tcMar>
               <w:top w:w="90" w:type="dxa"/>
@@ -8276,7 +7885,6 @@
               <w:bottom w:w="90" w:type="dxa"/>
               <w:end w:w="100" w:type="dxa"/>
             </w:tcMar>
-            <w:shd w:fill="EAF2F8"/>
           </w:tcPr>
           <w:p>
             <w:pPr>
@@ -8294,7 +7902,7 @@
         </w:tc>
         <w:tc>
           <w:tcPr>
-            <w:tcW w:type="dxa" w:w="5034"/>
+            <w:tcW w:type="dxa" w:w="4197"/>
             <w:vAlign w:val="center"/>
             <w:tcMar>
               <w:top w:w="90" w:type="dxa"/>
@@ -8302,7 +7910,6 @@
               <w:bottom w:w="90" w:type="dxa"/>
               <w:end w:w="100" w:type="dxa"/>
             </w:tcMar>
-            <w:shd w:fill="EAF2F8"/>
           </w:tcPr>
           <w:p>
             <w:pPr>
@@ -8325,7 +7932,7 @@
         </w:trPr>
         <w:tc>
           <w:tcPr>
-            <w:tcW w:type="dxa" w:w="1862"/>
+            <w:tcW w:type="dxa" w:w="1552"/>
             <w:vAlign w:val="center"/>
             <w:tcMar>
               <w:top w:w="90" w:type="dxa"/>
@@ -8350,7 +7957,7 @@
         </w:tc>
         <w:tc>
           <w:tcPr>
-            <w:tcW w:type="dxa" w:w="2896"/>
+            <w:tcW w:type="dxa" w:w="2415"/>
             <w:vAlign w:val="center"/>
             <w:tcMar>
               <w:top w:w="90" w:type="dxa"/>
@@ -8375,7 +7982,7 @@
         </w:tc>
         <w:tc>
           <w:tcPr>
-            <w:tcW w:type="dxa" w:w="5034"/>
+            <w:tcW w:type="dxa" w:w="4197"/>
             <w:vAlign w:val="center"/>
             <w:tcMar>
               <w:top w:w="90" w:type="dxa"/>
@@ -8504,10 +8111,14 @@
       </w:r>
     </w:p>
     <w:sectPr>
-      <w:footerReference w:type="default" r:id="rId9"/>
-      <w:pgSz w:w="12240" w:h="15840"/>
-      <w:pgMar w:top="1080" w:right="1224" w:bottom="1080" w:left="1224" w:header="720" w:footer="720" w:gutter="0"/>
+      <w:headerReference w:type="default" r:id="rId9"/>
+      <w:headerReference w:type="first" r:id="rId10"/>
+      <w:footerReference w:type="default" r:id="rId11"/>
+      <w:footerReference w:type="first" r:id="rId12"/>
+      <w:pgSz w:w="11909" w:h="16834"/>
+      <w:pgMar w:top="1512" w:right="1872" w:bottom="1440" w:left="1872" w:header="720" w:footer="720" w:gutter="0"/>
       <w:cols w:space="720"/>
+      <w:titlePg/>
       <w:docGrid w:linePitch="360"/>
     </w:sectPr>
   </w:body>
@@ -8519,26 +8130,46 @@
   <w:p>
     <w:pPr>
       <w:pStyle w:val="Footer"/>
-      <w:jc w:val="center"/>
     </w:pPr>
-    <w:r>
-      <w:rPr>
-        <w:rFonts w:ascii="Times New Roman" w:hAnsi="Times New Roman"/>
-        <w:sz w:val="18"/>
-      </w:rPr>
-      <w:t xml:space="preserve">QR Secures Capstone Project    </w:t>
-    </w:r>
-    <w:r>
-      <w:rPr>
-        <w:rFonts w:ascii="Times New Roman" w:hAnsi="Times New Roman"/>
-        <w:sz w:val="18"/>
-      </w:rPr>
-      <w:fldChar w:fldCharType="begin"/>
-      <w:instrText xml:space="preserve"> PAGE </w:instrText>
-      <w:fldChar w:fldCharType="end"/>
-    </w:r>
+    <w:r/>
   </w:p>
 </w:ftr>
+</file>
+
+<file path=word/footer2.xml><?xml version="1.0" encoding="utf-8"?>
+<w:ftr xmlns:m="http://schemas.openxmlformats.org/officeDocument/2006/math" xmlns:mc="http://schemas.openxmlformats.org/markup-compatibility/2006" xmlns:mo="http://schemas.microsoft.com/office/mac/office/2008/main" xmlns:mv="urn:schemas-microsoft-com:mac:vml" xmlns:o="urn:schemas-microsoft-com:office:office" xmlns:r="http://schemas.openxmlformats.org/officeDocument/2006/relationships" xmlns:v="urn:schemas-microsoft-com:vml" xmlns:w10="urn:schemas-microsoft-com:office:word" xmlns:w14="http://schemas.microsoft.com/office/word/2010/wordml" xmlns:w="http://schemas.openxmlformats.org/wordprocessingml/2006/main" xmlns:wne="http://schemas.microsoft.com/office/word/2006/wordml" xmlns:wp14="http://schemas.microsoft.com/office/word/2010/wordprocessingDrawing" xmlns:wp="http://schemas.openxmlformats.org/drawingml/2006/wordprocessingDrawing" xmlns:wpc="http://schemas.microsoft.com/office/word/2010/wordprocessingCanvas" xmlns:wpg="http://schemas.microsoft.com/office/word/2010/wordprocessingGroup" xmlns:wpi="http://schemas.microsoft.com/office/word/2010/wordprocessingInk" xmlns:wps="http://schemas.microsoft.com/office/word/2010/wordprocessingShape" mc:Ignorable="w14 wp14">
+  <w:p>
+    <w:pPr>
+      <w:pStyle w:val="Footer"/>
+    </w:pPr>
+    <w:r/>
+  </w:p>
+</w:ftr>
+</file>
+
+<file path=word/header1.xml><?xml version="1.0" encoding="utf-8"?>
+<w:hdr xmlns:m="http://schemas.openxmlformats.org/officeDocument/2006/math" xmlns:mc="http://schemas.openxmlformats.org/markup-compatibility/2006" xmlns:mo="http://schemas.microsoft.com/office/mac/office/2008/main" xmlns:mv="urn:schemas-microsoft-com:mac:vml" xmlns:o="urn:schemas-microsoft-com:office:office" xmlns:r="http://schemas.openxmlformats.org/officeDocument/2006/relationships" xmlns:v="urn:schemas-microsoft-com:vml" xmlns:w10="urn:schemas-microsoft-com:office:word" xmlns:w14="http://schemas.microsoft.com/office/word/2010/wordml" xmlns:w="http://schemas.openxmlformats.org/wordprocessingml/2006/main" xmlns:wne="http://schemas.microsoft.com/office/word/2006/wordml" xmlns:wp14="http://schemas.microsoft.com/office/word/2010/wordprocessingDrawing" xmlns:wp="http://schemas.openxmlformats.org/drawingml/2006/wordprocessingDrawing" xmlns:wpc="http://schemas.microsoft.com/office/word/2010/wordprocessingCanvas" xmlns:wpg="http://schemas.microsoft.com/office/word/2010/wordprocessingGroup" xmlns:wpi="http://schemas.microsoft.com/office/word/2010/wordprocessingInk" xmlns:wps="http://schemas.microsoft.com/office/word/2010/wordprocessingShape" mc:Ignorable="w14 wp14">
+  <w:p>
+    <w:pPr>
+      <w:pStyle w:val="Header"/>
+      <w:spacing w:after="160"/>
+      <w:pBdr>
+        <w:bottom w:val="single" w:sz="4" w:space="1" w:color="666666"/>
+      </w:pBdr>
+    </w:pPr>
+  </w:p>
+</w:hdr>
+</file>
+
+<file path=word/header2.xml><?xml version="1.0" encoding="utf-8"?>
+<w:hdr xmlns:m="http://schemas.openxmlformats.org/officeDocument/2006/math" xmlns:mc="http://schemas.openxmlformats.org/markup-compatibility/2006" xmlns:mo="http://schemas.microsoft.com/office/mac/office/2008/main" xmlns:mv="urn:schemas-microsoft-com:mac:vml" xmlns:o="urn:schemas-microsoft-com:office:office" xmlns:r="http://schemas.openxmlformats.org/officeDocument/2006/relationships" xmlns:v="urn:schemas-microsoft-com:vml" xmlns:w10="urn:schemas-microsoft-com:office:word" xmlns:w14="http://schemas.microsoft.com/office/word/2010/wordml" xmlns:w="http://schemas.openxmlformats.org/wordprocessingml/2006/main" xmlns:wne="http://schemas.microsoft.com/office/word/2006/wordml" xmlns:wp14="http://schemas.microsoft.com/office/word/2010/wordprocessingDrawing" xmlns:wp="http://schemas.openxmlformats.org/drawingml/2006/wordprocessingDrawing" xmlns:wpc="http://schemas.microsoft.com/office/word/2010/wordprocessingCanvas" xmlns:wpg="http://schemas.microsoft.com/office/word/2010/wordprocessingGroup" xmlns:wpi="http://schemas.microsoft.com/office/word/2010/wordprocessingInk" xmlns:wps="http://schemas.microsoft.com/office/word/2010/wordprocessingShape" mc:Ignorable="w14 wp14">
+  <w:p>
+    <w:pPr>
+      <w:pStyle w:val="Header"/>
+    </w:pPr>
+    <w:r/>
+  </w:p>
+</w:hdr>
 </file>
 
 <file path=word/numbering.xml><?xml version="1.0" encoding="utf-8"?>
@@ -8905,13 +8536,13 @@
     <w:qFormat/>
     <w:rsid w:val="00FC693F"/>
     <w:pPr>
-      <w:spacing w:line="240" w:lineRule="auto" w:after="120"/>
+      <w:spacing w:line="240" w:lineRule="auto" w:after="100"/>
       <w:jc w:val="both"/>
     </w:pPr>
     <w:rPr>
       <w:rFonts w:ascii="Times New Roman" w:hAnsi="Times New Roman" w:eastAsia="Times New Roman"/>
       <w:color w:val="000000"/>
-      <w:sz w:val="24"/>
+      <w:sz w:val="22"/>
     </w:rPr>
   </w:style>
   <w:style w:type="paragraph" w:styleId="Header">
@@ -8977,7 +8608,7 @@
       <w:b/>
       <w:bCs/>
       <w:color w:val="000000"/>
-      <w:sz w:val="30"/>
+      <w:sz w:val="28"/>
       <w:szCs w:val="28"/>
     </w:rPr>
   </w:style>
@@ -9001,7 +8632,7 @@
       <w:b/>
       <w:bCs/>
       <w:color w:val="000000"/>
-      <w:sz w:val="26"/>
+      <w:sz w:val="24"/>
       <w:szCs w:val="26"/>
     </w:rPr>
   </w:style>
@@ -9025,7 +8656,7 @@
       <w:b/>
       <w:bCs/>
       <w:color w:val="000000"/>
-      <w:sz w:val="24"/>
+      <w:sz w:val="22"/>
     </w:rPr>
   </w:style>
   <w:style w:type="paragraph" w:styleId="Heading4">
@@ -9269,7 +8900,7 @@
       <w:color w:val="000000"/>
       <w:spacing w:val="5"/>
       <w:kern w:val="28"/>
-      <w:sz w:val="40"/>
+      <w:sz w:val="28"/>
       <w:szCs w:val="52"/>
     </w:rPr>
   </w:style>

</xml_diff>